<commit_message>
edited menu und ignore file
</commit_message>
<xml_diff>
--- a/TOYAMIX ROVER Anleitung.docx
+++ b/TOYAMIX ROVER Anleitung.docx
@@ -64,20 +64,693 @@
       </w:pPr>
       <w:r>
         <w:rPr>
+          <w:rFonts w:ascii="Arial" w:hAnsi="Arial" w:cs="Arial"/>
           <w:b/>
           <w:bCs/>
           <w:noProof/>
+          <w:sz w:val="36"/>
+          <w:szCs w:val="36"/>
+          <w:lang w:val="de-DE"/>
+        </w:rPr>
+        <w:drawing>
+          <wp:anchor distT="0" distB="0" distL="114300" distR="114300" simplePos="0" relativeHeight="251680768" behindDoc="0" locked="0" layoutInCell="1" allowOverlap="1" wp14:anchorId="5BA65D20" wp14:editId="7D124A21">
+            <wp:simplePos x="0" y="0"/>
+            <wp:positionH relativeFrom="margin">
+              <wp:posOffset>1478915</wp:posOffset>
+            </wp:positionH>
+            <wp:positionV relativeFrom="paragraph">
+              <wp:posOffset>170180</wp:posOffset>
+            </wp:positionV>
+            <wp:extent cx="1209040" cy="1209040"/>
+            <wp:effectExtent l="0" t="0" r="0" b="0"/>
+            <wp:wrapNone/>
+            <wp:docPr id="1519607816" name="Picture 8"/>
+            <wp:cNvGraphicFramePr>
+              <a:graphicFrameLocks xmlns:a="http://schemas.openxmlformats.org/drawingml/2006/main" noChangeAspect="1"/>
+            </wp:cNvGraphicFramePr>
+            <a:graphic xmlns:a="http://schemas.openxmlformats.org/drawingml/2006/main">
+              <a:graphicData uri="http://schemas.openxmlformats.org/drawingml/2006/picture">
+                <pic:pic xmlns:pic="http://schemas.openxmlformats.org/drawingml/2006/picture">
+                  <pic:nvPicPr>
+                    <pic:cNvPr id="0" name="Picture 8"/>
+                    <pic:cNvPicPr>
+                      <a:picLocks noChangeAspect="1" noChangeArrowheads="1"/>
+                    </pic:cNvPicPr>
+                  </pic:nvPicPr>
+                  <pic:blipFill>
+                    <a:blip r:embed="rId8" cstate="print">
+                      <a:extLst>
+                        <a:ext uri="{28A0092B-C50C-407E-A947-70E740481C1C}">
+                          <a14:useLocalDpi xmlns:a14="http://schemas.microsoft.com/office/drawing/2010/main" val="0"/>
+                        </a:ext>
+                      </a:extLst>
+                    </a:blip>
+                    <a:srcRect/>
+                    <a:stretch>
+                      <a:fillRect/>
+                    </a:stretch>
+                  </pic:blipFill>
+                  <pic:spPr bwMode="auto">
+                    <a:xfrm>
+                      <a:off x="0" y="0"/>
+                      <a:ext cx="1209040" cy="1209040"/>
+                    </a:xfrm>
+                    <a:prstGeom prst="rect">
+                      <a:avLst/>
+                    </a:prstGeom>
+                    <a:noFill/>
+                    <a:ln>
+                      <a:noFill/>
+                    </a:ln>
+                  </pic:spPr>
+                </pic:pic>
+              </a:graphicData>
+            </a:graphic>
+            <wp14:sizeRelH relativeFrom="page">
+              <wp14:pctWidth>0</wp14:pctWidth>
+            </wp14:sizeRelH>
+            <wp14:sizeRelV relativeFrom="page">
+              <wp14:pctHeight>0</wp14:pctHeight>
+            </wp14:sizeRelV>
+          </wp:anchor>
+        </w:drawing>
+      </w:r>
+      <w:r>
+        <w:rPr>
+          <w:rFonts w:ascii="Arial" w:hAnsi="Arial" w:cs="Arial"/>
+          <w:b/>
+          <w:bCs/>
+          <w:noProof/>
+          <w:sz w:val="36"/>
+          <w:szCs w:val="36"/>
+          <w:lang w:val="de-DE"/>
+        </w:rPr>
+        <w:drawing>
+          <wp:anchor distT="0" distB="0" distL="114300" distR="114300" simplePos="0" relativeHeight="251661312" behindDoc="0" locked="0" layoutInCell="1" allowOverlap="1" wp14:anchorId="1F2AA36A" wp14:editId="21034B8B">
+            <wp:simplePos x="0" y="0"/>
+            <wp:positionH relativeFrom="column">
+              <wp:posOffset>2873375</wp:posOffset>
+            </wp:positionH>
+            <wp:positionV relativeFrom="paragraph">
+              <wp:posOffset>194945</wp:posOffset>
+            </wp:positionV>
+            <wp:extent cx="1224915" cy="791210"/>
+            <wp:effectExtent l="0" t="0" r="0" b="8890"/>
+            <wp:wrapNone/>
+            <wp:docPr id="654899550" name="Picture 1"/>
+            <wp:cNvGraphicFramePr>
+              <a:graphicFrameLocks xmlns:a="http://schemas.openxmlformats.org/drawingml/2006/main" noChangeAspect="1"/>
+            </wp:cNvGraphicFramePr>
+            <a:graphic xmlns:a="http://schemas.openxmlformats.org/drawingml/2006/main">
+              <a:graphicData uri="http://schemas.openxmlformats.org/drawingml/2006/picture">
+                <pic:pic xmlns:pic="http://schemas.openxmlformats.org/drawingml/2006/picture">
+                  <pic:nvPicPr>
+                    <pic:cNvPr id="654899550" name=""/>
+                    <pic:cNvPicPr/>
+                  </pic:nvPicPr>
+                  <pic:blipFill>
+                    <a:blip r:embed="rId9" cstate="print">
+                      <a:extLst>
+                        <a:ext uri="{28A0092B-C50C-407E-A947-70E740481C1C}">
+                          <a14:useLocalDpi xmlns:a14="http://schemas.microsoft.com/office/drawing/2010/main" val="0"/>
+                        </a:ext>
+                      </a:extLst>
+                    </a:blip>
+                    <a:stretch>
+                      <a:fillRect/>
+                    </a:stretch>
+                  </pic:blipFill>
+                  <pic:spPr>
+                    <a:xfrm>
+                      <a:off x="0" y="0"/>
+                      <a:ext cx="1224915" cy="791210"/>
+                    </a:xfrm>
+                    <a:prstGeom prst="rect">
+                      <a:avLst/>
+                    </a:prstGeom>
+                  </pic:spPr>
+                </pic:pic>
+              </a:graphicData>
+            </a:graphic>
+            <wp14:sizeRelH relativeFrom="page">
+              <wp14:pctWidth>0</wp14:pctWidth>
+            </wp14:sizeRelH>
+            <wp14:sizeRelV relativeFrom="page">
+              <wp14:pctHeight>0</wp14:pctHeight>
+            </wp14:sizeRelV>
+          </wp:anchor>
+        </w:drawing>
+      </w:r>
+      <w:r>
+        <w:rPr>
+          <w:rFonts w:ascii="Arial" w:hAnsi="Arial" w:cs="Arial"/>
+          <w:b/>
+          <w:bCs/>
+          <w:noProof/>
+          <w:sz w:val="36"/>
+          <w:szCs w:val="36"/>
+          <w:lang w:val="de-DE"/>
+        </w:rPr>
+        <w:drawing>
+          <wp:anchor distT="0" distB="0" distL="114300" distR="114300" simplePos="0" relativeHeight="251664384" behindDoc="0" locked="0" layoutInCell="1" allowOverlap="1" wp14:anchorId="6243BC1B" wp14:editId="1675E073">
+            <wp:simplePos x="0" y="0"/>
+            <wp:positionH relativeFrom="column">
+              <wp:posOffset>4243070</wp:posOffset>
+            </wp:positionH>
+            <wp:positionV relativeFrom="paragraph">
+              <wp:posOffset>208915</wp:posOffset>
+            </wp:positionV>
+            <wp:extent cx="641985" cy="791845"/>
+            <wp:effectExtent l="0" t="0" r="5715" b="8255"/>
+            <wp:wrapNone/>
+            <wp:docPr id="1421529483" name="Picture 2"/>
+            <wp:cNvGraphicFramePr>
+              <a:graphicFrameLocks xmlns:a="http://schemas.openxmlformats.org/drawingml/2006/main" noChangeAspect="1"/>
+            </wp:cNvGraphicFramePr>
+            <a:graphic xmlns:a="http://schemas.openxmlformats.org/drawingml/2006/main">
+              <a:graphicData uri="http://schemas.openxmlformats.org/drawingml/2006/picture">
+                <pic:pic xmlns:pic="http://schemas.openxmlformats.org/drawingml/2006/picture">
+                  <pic:nvPicPr>
+                    <pic:cNvPr id="0" name="Picture 2"/>
+                    <pic:cNvPicPr>
+                      <a:picLocks noChangeAspect="1" noChangeArrowheads="1"/>
+                    </pic:cNvPicPr>
+                  </pic:nvPicPr>
+                  <pic:blipFill rotWithShape="1">
+                    <a:blip r:embed="rId10" cstate="print">
+                      <a:extLst>
+                        <a:ext uri="{28A0092B-C50C-407E-A947-70E740481C1C}">
+                          <a14:useLocalDpi xmlns:a14="http://schemas.microsoft.com/office/drawing/2010/main" val="0"/>
+                        </a:ext>
+                      </a:extLst>
+                    </a:blip>
+                    <a:srcRect l="18281" t="13254" r="19115" b="9520"/>
+                    <a:stretch>
+                      <a:fillRect/>
+                    </a:stretch>
+                  </pic:blipFill>
+                  <pic:spPr bwMode="auto">
+                    <a:xfrm>
+                      <a:off x="0" y="0"/>
+                      <a:ext cx="641985" cy="791845"/>
+                    </a:xfrm>
+                    <a:prstGeom prst="rect">
+                      <a:avLst/>
+                    </a:prstGeom>
+                    <a:noFill/>
+                    <a:ln>
+                      <a:noFill/>
+                    </a:ln>
+                    <a:extLst>
+                      <a:ext uri="{53640926-AAD7-44D8-BBD7-CCE9431645EC}">
+                        <a14:shadowObscured xmlns:a14="http://schemas.microsoft.com/office/drawing/2010/main"/>
+                      </a:ext>
+                    </a:extLst>
+                  </pic:spPr>
+                </pic:pic>
+              </a:graphicData>
+            </a:graphic>
+            <wp14:sizeRelH relativeFrom="page">
+              <wp14:pctWidth>0</wp14:pctWidth>
+            </wp14:sizeRelH>
+            <wp14:sizeRelV relativeFrom="page">
+              <wp14:pctHeight>0</wp14:pctHeight>
+            </wp14:sizeRelV>
+          </wp:anchor>
+        </w:drawing>
+      </w:r>
+      <w:r>
+        <w:rPr>
+          <w:rFonts w:ascii="Arial" w:hAnsi="Arial" w:cs="Arial"/>
+          <w:b/>
+          <w:bCs/>
+          <w:noProof/>
+          <w:sz w:val="36"/>
+          <w:szCs w:val="36"/>
+          <w:lang w:val="de-DE"/>
+        </w:rPr>
+        <w:drawing>
+          <wp:anchor distT="0" distB="0" distL="114300" distR="114300" simplePos="0" relativeHeight="251683840" behindDoc="0" locked="0" layoutInCell="1" allowOverlap="1" wp14:anchorId="17BB0C71" wp14:editId="43306429">
+            <wp:simplePos x="0" y="0"/>
+            <wp:positionH relativeFrom="margin">
+              <wp:posOffset>4987925</wp:posOffset>
+            </wp:positionH>
+            <wp:positionV relativeFrom="paragraph">
+              <wp:posOffset>105410</wp:posOffset>
+            </wp:positionV>
+            <wp:extent cx="1828800" cy="871855"/>
+            <wp:effectExtent l="0" t="0" r="0" b="4445"/>
+            <wp:wrapNone/>
+            <wp:docPr id="1057642067" name="Picture 9"/>
+            <wp:cNvGraphicFramePr>
+              <a:graphicFrameLocks xmlns:a="http://schemas.openxmlformats.org/drawingml/2006/main" noChangeAspect="1"/>
+            </wp:cNvGraphicFramePr>
+            <a:graphic xmlns:a="http://schemas.openxmlformats.org/drawingml/2006/main">
+              <a:graphicData uri="http://schemas.openxmlformats.org/drawingml/2006/picture">
+                <pic:pic xmlns:pic="http://schemas.openxmlformats.org/drawingml/2006/picture">
+                  <pic:nvPicPr>
+                    <pic:cNvPr id="0" name="Picture 9"/>
+                    <pic:cNvPicPr>
+                      <a:picLocks noChangeAspect="1" noChangeArrowheads="1"/>
+                    </pic:cNvPicPr>
+                  </pic:nvPicPr>
+                  <pic:blipFill>
+                    <a:blip r:embed="rId11" cstate="print">
+                      <a:extLst>
+                        <a:ext uri="{28A0092B-C50C-407E-A947-70E740481C1C}">
+                          <a14:useLocalDpi xmlns:a14="http://schemas.microsoft.com/office/drawing/2010/main" val="0"/>
+                        </a:ext>
+                      </a:extLst>
+                    </a:blip>
+                    <a:srcRect/>
+                    <a:stretch>
+                      <a:fillRect/>
+                    </a:stretch>
+                  </pic:blipFill>
+                  <pic:spPr bwMode="auto">
+                    <a:xfrm>
+                      <a:off x="0" y="0"/>
+                      <a:ext cx="1828800" cy="871855"/>
+                    </a:xfrm>
+                    <a:prstGeom prst="rect">
+                      <a:avLst/>
+                    </a:prstGeom>
+                    <a:noFill/>
+                    <a:ln>
+                      <a:noFill/>
+                    </a:ln>
+                  </pic:spPr>
+                </pic:pic>
+              </a:graphicData>
+            </a:graphic>
+            <wp14:sizeRelH relativeFrom="page">
+              <wp14:pctWidth>0</wp14:pctWidth>
+            </wp14:sizeRelH>
+            <wp14:sizeRelV relativeFrom="page">
+              <wp14:pctHeight>0</wp14:pctHeight>
+            </wp14:sizeRelV>
+          </wp:anchor>
+        </w:drawing>
+      </w:r>
+      <w:r>
+        <w:rPr>
+          <w:rFonts w:ascii="Arial" w:hAnsi="Arial" w:cs="Arial"/>
+          <w:b/>
+          <w:bCs/>
+          <w:noProof/>
+          <w:sz w:val="32"/>
+          <w:szCs w:val="32"/>
+          <w:lang w:val="de-DE"/>
+        </w:rPr>
+        <w:drawing>
+          <wp:anchor distT="0" distB="0" distL="114300" distR="114300" simplePos="0" relativeHeight="251658240" behindDoc="0" locked="0" layoutInCell="1" allowOverlap="1" wp14:anchorId="6BB2ADC5" wp14:editId="327F3E34">
+            <wp:simplePos x="0" y="0"/>
+            <wp:positionH relativeFrom="column">
+              <wp:posOffset>43180</wp:posOffset>
+            </wp:positionH>
+            <wp:positionV relativeFrom="paragraph">
+              <wp:posOffset>273685</wp:posOffset>
+            </wp:positionV>
+            <wp:extent cx="1275080" cy="1052830"/>
+            <wp:effectExtent l="0" t="0" r="1270" b="0"/>
+            <wp:wrapNone/>
+            <wp:docPr id="2032397776" name="Picture 1"/>
+            <wp:cNvGraphicFramePr>
+              <a:graphicFrameLocks xmlns:a="http://schemas.openxmlformats.org/drawingml/2006/main" noChangeAspect="1"/>
+            </wp:cNvGraphicFramePr>
+            <a:graphic xmlns:a="http://schemas.openxmlformats.org/drawingml/2006/main">
+              <a:graphicData uri="http://schemas.openxmlformats.org/drawingml/2006/picture">
+                <pic:pic xmlns:pic="http://schemas.openxmlformats.org/drawingml/2006/picture">
+                  <pic:nvPicPr>
+                    <pic:cNvPr id="0" name="Picture 1"/>
+                    <pic:cNvPicPr>
+                      <a:picLocks noChangeAspect="1" noChangeArrowheads="1"/>
+                    </pic:cNvPicPr>
+                  </pic:nvPicPr>
+                  <pic:blipFill rotWithShape="1">
+                    <a:blip r:embed="rId12" cstate="print">
+                      <a:extLst>
+                        <a:ext uri="{28A0092B-C50C-407E-A947-70E740481C1C}">
+                          <a14:useLocalDpi xmlns:a14="http://schemas.microsoft.com/office/drawing/2010/main" val="0"/>
+                        </a:ext>
+                      </a:extLst>
+                    </a:blip>
+                    <a:srcRect l="12342" t="21065" r="21700" b="24460"/>
+                    <a:stretch>
+                      <a:fillRect/>
+                    </a:stretch>
+                  </pic:blipFill>
+                  <pic:spPr bwMode="auto">
+                    <a:xfrm>
+                      <a:off x="0" y="0"/>
+                      <a:ext cx="1275080" cy="1052830"/>
+                    </a:xfrm>
+                    <a:prstGeom prst="rect">
+                      <a:avLst/>
+                    </a:prstGeom>
+                    <a:noFill/>
+                    <a:ln>
+                      <a:noFill/>
+                    </a:ln>
+                    <a:extLst>
+                      <a:ext uri="{53640926-AAD7-44D8-BBD7-CCE9431645EC}">
+                        <a14:shadowObscured xmlns:a14="http://schemas.microsoft.com/office/drawing/2010/main"/>
+                      </a:ext>
+                    </a:extLst>
+                  </pic:spPr>
+                </pic:pic>
+              </a:graphicData>
+            </a:graphic>
+            <wp14:sizeRelH relativeFrom="page">
+              <wp14:pctWidth>0</wp14:pctWidth>
+            </wp14:sizeRelH>
+            <wp14:sizeRelV relativeFrom="page">
+              <wp14:pctHeight>0</wp14:pctHeight>
+            </wp14:sizeRelV>
+          </wp:anchor>
+        </w:drawing>
+      </w:r>
+      <w:r>
+        <w:rPr>
+          <w:rFonts w:ascii="Arial" w:hAnsi="Arial" w:cs="Arial"/>
+          <w:b/>
+          <w:bCs/>
+          <w:noProof/>
+          <w:sz w:val="36"/>
+          <w:szCs w:val="36"/>
+          <w:lang w:val="de-DE"/>
+        </w:rPr>
+        <w:drawing>
+          <wp:anchor distT="0" distB="0" distL="114300" distR="114300" simplePos="0" relativeHeight="251673600" behindDoc="0" locked="0" layoutInCell="1" allowOverlap="1" wp14:anchorId="571EFD0C" wp14:editId="56822B67">
+            <wp:simplePos x="0" y="0"/>
+            <wp:positionH relativeFrom="column">
+              <wp:posOffset>-239395</wp:posOffset>
+            </wp:positionH>
+            <wp:positionV relativeFrom="paragraph">
+              <wp:posOffset>1734185</wp:posOffset>
+            </wp:positionV>
+            <wp:extent cx="1507490" cy="1130300"/>
+            <wp:effectExtent l="0" t="0" r="0" b="0"/>
+            <wp:wrapNone/>
+            <wp:docPr id="1846722500" name="Picture 5"/>
+            <wp:cNvGraphicFramePr>
+              <a:graphicFrameLocks xmlns:a="http://schemas.openxmlformats.org/drawingml/2006/main" noChangeAspect="1"/>
+            </wp:cNvGraphicFramePr>
+            <a:graphic xmlns:a="http://schemas.openxmlformats.org/drawingml/2006/main">
+              <a:graphicData uri="http://schemas.openxmlformats.org/drawingml/2006/picture">
+                <pic:pic xmlns:pic="http://schemas.openxmlformats.org/drawingml/2006/picture">
+                  <pic:nvPicPr>
+                    <pic:cNvPr id="0" name="Picture 5"/>
+                    <pic:cNvPicPr>
+                      <a:picLocks noChangeAspect="1" noChangeArrowheads="1"/>
+                    </pic:cNvPicPr>
+                  </pic:nvPicPr>
+                  <pic:blipFill>
+                    <a:blip r:embed="rId13" cstate="print">
+                      <a:extLst>
+                        <a:ext uri="{28A0092B-C50C-407E-A947-70E740481C1C}">
+                          <a14:useLocalDpi xmlns:a14="http://schemas.microsoft.com/office/drawing/2010/main" val="0"/>
+                        </a:ext>
+                      </a:extLst>
+                    </a:blip>
+                    <a:srcRect/>
+                    <a:stretch>
+                      <a:fillRect/>
+                    </a:stretch>
+                  </pic:blipFill>
+                  <pic:spPr bwMode="auto">
+                    <a:xfrm>
+                      <a:off x="0" y="0"/>
+                      <a:ext cx="1507490" cy="1130300"/>
+                    </a:xfrm>
+                    <a:prstGeom prst="rect">
+                      <a:avLst/>
+                    </a:prstGeom>
+                    <a:noFill/>
+                    <a:ln>
+                      <a:noFill/>
+                    </a:ln>
+                  </pic:spPr>
+                </pic:pic>
+              </a:graphicData>
+            </a:graphic>
+            <wp14:sizeRelH relativeFrom="page">
+              <wp14:pctWidth>0</wp14:pctWidth>
+            </wp14:sizeRelH>
+            <wp14:sizeRelV relativeFrom="page">
+              <wp14:pctHeight>0</wp14:pctHeight>
+            </wp14:sizeRelV>
+          </wp:anchor>
+        </w:drawing>
+      </w:r>
+      <w:r>
+        <w:rPr>
+          <w:b/>
+          <w:bCs/>
+          <w:noProof/>
         </w:rPr>
         <mc:AlternateContent>
           <mc:Choice Requires="wps">
             <w:drawing>
-              <wp:anchor distT="0" distB="0" distL="114300" distR="114300" simplePos="0" relativeHeight="251666432" behindDoc="0" locked="0" layoutInCell="1" allowOverlap="1" wp14:anchorId="278314AA" wp14:editId="2E7351E7">
+              <wp:anchor distT="0" distB="0" distL="114300" distR="114300" simplePos="0" relativeHeight="251675648" behindDoc="0" locked="0" layoutInCell="1" allowOverlap="1" wp14:anchorId="25C2E489" wp14:editId="5AC7F871">
+                <wp:simplePos x="0" y="0"/>
+                <wp:positionH relativeFrom="margin">
+                  <wp:posOffset>345440</wp:posOffset>
+                </wp:positionH>
+                <wp:positionV relativeFrom="paragraph">
+                  <wp:posOffset>2896870</wp:posOffset>
+                </wp:positionV>
+                <wp:extent cx="1507490" cy="635"/>
+                <wp:effectExtent l="0" t="0" r="8890" b="0"/>
+                <wp:wrapNone/>
+                <wp:docPr id="1937947356" name="Text Box 1"/>
+                <wp:cNvGraphicFramePr/>
+                <a:graphic xmlns:a="http://schemas.openxmlformats.org/drawingml/2006/main">
+                  <a:graphicData uri="http://schemas.microsoft.com/office/word/2010/wordprocessingShape">
+                    <wps:wsp>
+                      <wps:cNvSpPr txBox="1"/>
+                      <wps:spPr>
+                        <a:xfrm>
+                          <a:off x="0" y="0"/>
+                          <a:ext cx="1507490" cy="635"/>
+                        </a:xfrm>
+                        <a:prstGeom prst="rect">
+                          <a:avLst/>
+                        </a:prstGeom>
+                        <a:solidFill>
+                          <a:prstClr val="white"/>
+                        </a:solidFill>
+                        <a:ln>
+                          <a:noFill/>
+                        </a:ln>
+                      </wps:spPr>
+                      <wps:txbx>
+                        <w:txbxContent>
+                          <w:p>
+                            <w:pPr>
+                              <w:pStyle w:val="Caption"/>
+                              <w:rPr>
+                                <w:rFonts w:ascii="Arial" w:hAnsi="Arial" w:cs="Arial"/>
+                                <w:noProof/>
+                                <w:sz w:val="36"/>
+                                <w:szCs w:val="36"/>
+                                <w:lang w:val="de-DE"/>
+                              </w:rPr>
+                            </w:pPr>
+                            <w:r>
+                              <w:t>K170P</w:t>
+                            </w:r>
+                          </w:p>
+                        </w:txbxContent>
+                      </wps:txbx>
+                      <wps:bodyPr rot="0" spcFirstLastPara="0" vertOverflow="overflow" horzOverflow="overflow" vert="horz" wrap="none" lIns="0" tIns="0" rIns="0" bIns="0" numCol="1" spcCol="0" rtlCol="0" fromWordArt="0" anchor="t" anchorCtr="0" forceAA="0" compatLnSpc="1">
+                        <a:prstTxWarp prst="textNoShape">
+                          <a:avLst/>
+                        </a:prstTxWarp>
+                        <a:spAutoFit/>
+                      </wps:bodyPr>
+                    </wps:wsp>
+                  </a:graphicData>
+                </a:graphic>
+              </wp:anchor>
+            </w:drawing>
+          </mc:Choice>
+          <mc:Fallback>
+            <w:pict>
+              <v:shapetype w14:anchorId="25C2E489" id="_x0000_t202" coordsize="21600,21600" o:spt="202" path="m,l,21600r21600,l21600,xe">
+                <v:stroke joinstyle="miter"/>
+                <v:path gradientshapeok="t" o:connecttype="rect"/>
+              </v:shapetype>
+              <v:shape id="Text Box 1" o:spid="_x0000_s1026" type="#_x0000_t202" style="position:absolute;left:0;text-align:left;margin-left:27.2pt;margin-top:228.1pt;width:118.7pt;height:.05pt;z-index:251675648;visibility:visible;mso-wrap-style:none;mso-wrap-distance-left:9pt;mso-wrap-distance-top:0;mso-wrap-distance-right:9pt;mso-wrap-distance-bottom:0;mso-position-horizontal:absolute;mso-position-horizontal-relative:margin;mso-position-vertical:absolute;mso-position-vertical-relative:text;v-text-anchor:top" o:gfxdata="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" stroked="f">
+                <v:textbox style="mso-fit-shape-to-text:t" inset="0,0,0,0">
+                  <w:txbxContent>
+                    <w:p>
+                      <w:pPr>
+                        <w:pStyle w:val="Caption"/>
+                        <w:rPr>
+                          <w:rFonts w:ascii="Arial" w:hAnsi="Arial" w:cs="Arial"/>
+                          <w:noProof/>
+                          <w:sz w:val="36"/>
+                          <w:szCs w:val="36"/>
+                          <w:lang w:val="de-DE"/>
+                        </w:rPr>
+                      </w:pPr>
+                      <w:r>
+                        <w:t>K170P</w:t>
+                      </w:r>
+                    </w:p>
+                  </w:txbxContent>
+                </v:textbox>
+                <w10:wrap anchorx="margin"/>
+              </v:shape>
+            </w:pict>
+          </mc:Fallback>
+        </mc:AlternateContent>
+      </w:r>
+      <w:r>
+        <w:rPr>
+          <w:rFonts w:ascii="Arial" w:hAnsi="Arial" w:cs="Arial"/>
+          <w:b/>
+          <w:bCs/>
+          <w:sz w:val="32"/>
+          <w:szCs w:val="32"/>
+          <w:lang w:val="de-DE"/>
+        </w:rPr>
+        <w:t>Bauteile</w:t>
+      </w:r>
+    </w:p>
+    <w:p>
+      <w:pPr>
+        <w:rPr>
+          <w:rFonts w:ascii="Arial" w:hAnsi="Arial" w:cs="Arial"/>
+          <w:sz w:val="36"/>
+          <w:szCs w:val="36"/>
+          <w:lang w:val="de-DE"/>
+        </w:rPr>
+      </w:pPr>
+    </w:p>
+    <w:p>
+      <w:pPr>
+        <w:rPr>
+          <w:rFonts w:ascii="Arial" w:hAnsi="Arial" w:cs="Arial"/>
+          <w:sz w:val="36"/>
+          <w:szCs w:val="36"/>
+          <w:lang w:val="de-DE"/>
+        </w:rPr>
+      </w:pPr>
+      <w:r>
+        <w:rPr>
+          <w:b/>
+          <w:bCs/>
+          <w:noProof/>
+        </w:rPr>
+        <mc:AlternateContent>
+          <mc:Choice Requires="wps">
+            <w:drawing>
+              <wp:anchor distT="0" distB="0" distL="114300" distR="114300" simplePos="0" relativeHeight="251663360" behindDoc="0" locked="0" layoutInCell="1" allowOverlap="1" wp14:anchorId="032E7C58" wp14:editId="4492E1B7">
                 <wp:simplePos x="0" y="0"/>
                 <wp:positionH relativeFrom="column">
-                  <wp:posOffset>2626995</wp:posOffset>
+                  <wp:posOffset>3290570</wp:posOffset>
                 </wp:positionH>
                 <wp:positionV relativeFrom="paragraph">
-                  <wp:posOffset>1105535</wp:posOffset>
+                  <wp:posOffset>255270</wp:posOffset>
+                </wp:positionV>
+                <wp:extent cx="1224915" cy="635"/>
+                <wp:effectExtent l="0" t="0" r="0" b="0"/>
+                <wp:wrapNone/>
+                <wp:docPr id="11249692" name="Text Box 1"/>
+                <wp:cNvGraphicFramePr/>
+                <a:graphic xmlns:a="http://schemas.openxmlformats.org/drawingml/2006/main">
+                  <a:graphicData uri="http://schemas.microsoft.com/office/word/2010/wordprocessingShape">
+                    <wps:wsp>
+                      <wps:cNvSpPr txBox="1"/>
+                      <wps:spPr>
+                        <a:xfrm>
+                          <a:off x="0" y="0"/>
+                          <a:ext cx="1224915" cy="635"/>
+                        </a:xfrm>
+                        <a:prstGeom prst="rect">
+                          <a:avLst/>
+                        </a:prstGeom>
+                        <a:solidFill>
+                          <a:prstClr val="white"/>
+                        </a:solidFill>
+                        <a:ln>
+                          <a:noFill/>
+                        </a:ln>
+                      </wps:spPr>
+                      <wps:txbx>
+                        <w:txbxContent>
+                          <w:p>
+                            <w:pPr>
+                              <w:pStyle w:val="Caption"/>
+                              <w:rPr>
+                                <w:rFonts w:ascii="Arial" w:hAnsi="Arial" w:cs="Arial"/>
+                                <w:sz w:val="36"/>
+                                <w:szCs w:val="36"/>
+                                <w:lang w:val="de-DE"/>
+                              </w:rPr>
+                            </w:pPr>
+                            <w:r>
+                              <w:t>Motor</w:t>
+                            </w:r>
+                          </w:p>
+                        </w:txbxContent>
+                      </wps:txbx>
+                      <wps:bodyPr rot="0" spcFirstLastPara="0" vertOverflow="overflow" horzOverflow="overflow" vert="horz" wrap="none" lIns="0" tIns="0" rIns="0" bIns="0" numCol="1" spcCol="0" rtlCol="0" fromWordArt="0" anchor="t" anchorCtr="0" forceAA="0" compatLnSpc="1">
+                        <a:prstTxWarp prst="textNoShape">
+                          <a:avLst/>
+                        </a:prstTxWarp>
+                        <a:spAutoFit/>
+                      </wps:bodyPr>
+                    </wps:wsp>
+                  </a:graphicData>
+                </a:graphic>
+              </wp:anchor>
+            </w:drawing>
+          </mc:Choice>
+          <mc:Fallback>
+            <w:pict>
+              <v:shape w14:anchorId="032E7C58" id="_x0000_s1027" type="#_x0000_t202" style="position:absolute;margin-left:259.1pt;margin-top:20.1pt;width:96.45pt;height:.05pt;z-index:251663360;visibility:visible;mso-wrap-style:none;mso-wrap-distance-left:9pt;mso-wrap-distance-top:0;mso-wrap-distance-right:9pt;mso-wrap-distance-bottom:0;mso-position-horizontal:absolute;mso-position-horizontal-relative:text;mso-position-vertical:absolute;mso-position-vertical-relative:text;v-text-anchor:top" o:gfxdata="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" stroked="f">
+                <v:textbox style="mso-fit-shape-to-text:t" inset="0,0,0,0">
+                  <w:txbxContent>
+                    <w:p>
+                      <w:pPr>
+                        <w:pStyle w:val="Caption"/>
+                        <w:rPr>
+                          <w:rFonts w:ascii="Arial" w:hAnsi="Arial" w:cs="Arial"/>
+                          <w:sz w:val="36"/>
+                          <w:szCs w:val="36"/>
+                          <w:lang w:val="de-DE"/>
+                        </w:rPr>
+                      </w:pPr>
+                      <w:r>
+                        <w:t>Motor</w:t>
+                      </w:r>
+                    </w:p>
+                  </w:txbxContent>
+                </v:textbox>
+              </v:shape>
+            </w:pict>
+          </mc:Fallback>
+        </mc:AlternateContent>
+      </w:r>
+      <w:r>
+        <w:rPr>
+          <w:b/>
+          <w:bCs/>
+          <w:noProof/>
+        </w:rPr>
+        <mc:AlternateContent>
+          <mc:Choice Requires="wps">
+            <w:drawing>
+              <wp:anchor distT="0" distB="0" distL="114300" distR="114300" simplePos="0" relativeHeight="251666432" behindDoc="0" locked="0" layoutInCell="1" allowOverlap="1" wp14:anchorId="278314AA" wp14:editId="51E9FB14">
+                <wp:simplePos x="0" y="0"/>
+                <wp:positionH relativeFrom="column">
+                  <wp:posOffset>4189095</wp:posOffset>
+                </wp:positionH>
+                <wp:positionV relativeFrom="paragraph">
+                  <wp:posOffset>247015</wp:posOffset>
                 </wp:positionV>
                 <wp:extent cx="914400" cy="635"/>
                 <wp:effectExtent l="0" t="0" r="635" b="0"/>
@@ -145,11 +818,7 @@
           </mc:Choice>
           <mc:Fallback>
             <w:pict>
-              <v:shapetype w14:anchorId="278314AA" id="_x0000_t202" coordsize="21600,21600" o:spt="202" path="m,l,21600r21600,l21600,xe">
-                <v:stroke joinstyle="miter"/>
-                <v:path gradientshapeok="t" o:connecttype="rect"/>
-              </v:shapetype>
-              <v:shape id="Text Box 1" o:spid="_x0000_s1026" type="#_x0000_t202" style="position:absolute;left:0;text-align:left;margin-left:206.85pt;margin-top:87.05pt;width:1in;height:.05pt;z-index:251666432;visibility:visible;mso-wrap-style:none;mso-wrap-distance-left:9pt;mso-wrap-distance-top:0;mso-wrap-distance-right:9pt;mso-wrap-distance-bottom:0;mso-position-horizontal:absolute;mso-position-horizontal-relative:text;mso-position-vertical:absolute;mso-position-vertical-relative:text;v-text-anchor:top" o:gfxdata="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" stroked="f">
+              <v:shape w14:anchorId="278314AA" id="_x0000_s1028" type="#_x0000_t202" style="position:absolute;margin-left:329.85pt;margin-top:19.45pt;width:1in;height:.05pt;z-index:251666432;visibility:visible;mso-wrap-style:none;mso-wrap-distance-left:9pt;mso-wrap-distance-top:0;mso-wrap-distance-right:9pt;mso-wrap-distance-bottom:0;mso-position-horizontal:absolute;mso-position-horizontal-relative:text;mso-position-vertical:absolute;mso-position-vertical-relative:text;v-text-anchor:top" o:gfxdata="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" stroked="f">
                 <v:textbox style="mso-fit-shape-to-text:t" inset="0,0,0,0">
                   <w:txbxContent>
                     <w:p>
@@ -185,341 +854,20 @@
       </w:r>
       <w:r>
         <w:rPr>
-          <w:rFonts w:ascii="Arial" w:hAnsi="Arial" w:cs="Arial"/>
           <w:b/>
           <w:bCs/>
           <w:noProof/>
-          <w:sz w:val="36"/>
-          <w:szCs w:val="36"/>
-          <w:lang w:val="de-DE"/>
-        </w:rPr>
-        <w:drawing>
-          <wp:anchor distT="0" distB="0" distL="114300" distR="114300" simplePos="0" relativeHeight="251664384" behindDoc="0" locked="0" layoutInCell="1" allowOverlap="1" wp14:anchorId="6243BC1B" wp14:editId="7EC38932">
-            <wp:simplePos x="0" y="0"/>
-            <wp:positionH relativeFrom="column">
-              <wp:posOffset>2680970</wp:posOffset>
-            </wp:positionH>
-            <wp:positionV relativeFrom="paragraph">
-              <wp:posOffset>288925</wp:posOffset>
-            </wp:positionV>
-            <wp:extent cx="641985" cy="791845"/>
-            <wp:effectExtent l="0" t="0" r="5715" b="8255"/>
-            <wp:wrapNone/>
-            <wp:docPr id="1421529483" name="Picture 2"/>
-            <wp:cNvGraphicFramePr>
-              <a:graphicFrameLocks xmlns:a="http://schemas.openxmlformats.org/drawingml/2006/main" noChangeAspect="1"/>
-            </wp:cNvGraphicFramePr>
-            <a:graphic xmlns:a="http://schemas.openxmlformats.org/drawingml/2006/main">
-              <a:graphicData uri="http://schemas.openxmlformats.org/drawingml/2006/picture">
-                <pic:pic xmlns:pic="http://schemas.openxmlformats.org/drawingml/2006/picture">
-                  <pic:nvPicPr>
-                    <pic:cNvPr id="0" name="Picture 2"/>
-                    <pic:cNvPicPr>
-                      <a:picLocks noChangeAspect="1" noChangeArrowheads="1"/>
-                    </pic:cNvPicPr>
-                  </pic:nvPicPr>
-                  <pic:blipFill rotWithShape="1">
-                    <a:blip r:embed="rId6" cstate="print">
-                      <a:extLst>
-                        <a:ext uri="{28A0092B-C50C-407E-A947-70E740481C1C}">
-                          <a14:useLocalDpi xmlns:a14="http://schemas.microsoft.com/office/drawing/2010/main" val="0"/>
-                        </a:ext>
-                      </a:extLst>
-                    </a:blip>
-                    <a:srcRect l="18281" t="13254" r="19115" b="9520"/>
-                    <a:stretch>
-                      <a:fillRect/>
-                    </a:stretch>
-                  </pic:blipFill>
-                  <pic:spPr bwMode="auto">
-                    <a:xfrm>
-                      <a:off x="0" y="0"/>
-                      <a:ext cx="641985" cy="791845"/>
-                    </a:xfrm>
-                    <a:prstGeom prst="rect">
-                      <a:avLst/>
-                    </a:prstGeom>
-                    <a:noFill/>
-                    <a:ln>
-                      <a:noFill/>
-                    </a:ln>
-                    <a:extLst>
-                      <a:ext uri="{53640926-AAD7-44D8-BBD7-CCE9431645EC}">
-                        <a14:shadowObscured xmlns:a14="http://schemas.microsoft.com/office/drawing/2010/main"/>
-                      </a:ext>
-                    </a:extLst>
-                  </pic:spPr>
-                </pic:pic>
-              </a:graphicData>
-            </a:graphic>
-            <wp14:sizeRelH relativeFrom="page">
-              <wp14:pctWidth>0</wp14:pctWidth>
-            </wp14:sizeRelH>
-            <wp14:sizeRelV relativeFrom="page">
-              <wp14:pctHeight>0</wp14:pctHeight>
-            </wp14:sizeRelV>
-          </wp:anchor>
-        </w:drawing>
-      </w:r>
-      <w:r>
-        <w:rPr>
-          <w:rFonts w:ascii="Arial" w:hAnsi="Arial" w:cs="Arial"/>
-          <w:b/>
-          <w:bCs/>
-          <w:noProof/>
-          <w:sz w:val="36"/>
-          <w:szCs w:val="36"/>
-          <w:lang w:val="de-DE"/>
-        </w:rPr>
-        <w:drawing>
-          <wp:anchor distT="0" distB="0" distL="114300" distR="114300" simplePos="0" relativeHeight="251683840" behindDoc="0" locked="0" layoutInCell="1" allowOverlap="1" wp14:anchorId="17BB0C71" wp14:editId="35B869E7">
-            <wp:simplePos x="0" y="0"/>
-            <wp:positionH relativeFrom="margin">
-              <wp:posOffset>3400425</wp:posOffset>
-            </wp:positionH>
-            <wp:positionV relativeFrom="paragraph">
-              <wp:posOffset>281305</wp:posOffset>
-            </wp:positionV>
-            <wp:extent cx="1828800" cy="871855"/>
-            <wp:effectExtent l="0" t="0" r="0" b="4445"/>
-            <wp:wrapNone/>
-            <wp:docPr id="1057642067" name="Picture 9"/>
-            <wp:cNvGraphicFramePr>
-              <a:graphicFrameLocks xmlns:a="http://schemas.openxmlformats.org/drawingml/2006/main" noChangeAspect="1"/>
-            </wp:cNvGraphicFramePr>
-            <a:graphic xmlns:a="http://schemas.openxmlformats.org/drawingml/2006/main">
-              <a:graphicData uri="http://schemas.openxmlformats.org/drawingml/2006/picture">
-                <pic:pic xmlns:pic="http://schemas.openxmlformats.org/drawingml/2006/picture">
-                  <pic:nvPicPr>
-                    <pic:cNvPr id="0" name="Picture 9"/>
-                    <pic:cNvPicPr>
-                      <a:picLocks noChangeAspect="1" noChangeArrowheads="1"/>
-                    </pic:cNvPicPr>
-                  </pic:nvPicPr>
-                  <pic:blipFill>
-                    <a:blip r:embed="rId7" cstate="print">
-                      <a:extLst>
-                        <a:ext uri="{28A0092B-C50C-407E-A947-70E740481C1C}">
-                          <a14:useLocalDpi xmlns:a14="http://schemas.microsoft.com/office/drawing/2010/main" val="0"/>
-                        </a:ext>
-                      </a:extLst>
-                    </a:blip>
-                    <a:srcRect/>
-                    <a:stretch>
-                      <a:fillRect/>
-                    </a:stretch>
-                  </pic:blipFill>
-                  <pic:spPr bwMode="auto">
-                    <a:xfrm>
-                      <a:off x="0" y="0"/>
-                      <a:ext cx="1828800" cy="871855"/>
-                    </a:xfrm>
-                    <a:prstGeom prst="rect">
-                      <a:avLst/>
-                    </a:prstGeom>
-                    <a:noFill/>
-                    <a:ln>
-                      <a:noFill/>
-                    </a:ln>
-                  </pic:spPr>
-                </pic:pic>
-              </a:graphicData>
-            </a:graphic>
-            <wp14:sizeRelH relativeFrom="page">
-              <wp14:pctWidth>0</wp14:pctWidth>
-            </wp14:sizeRelH>
-            <wp14:sizeRelV relativeFrom="page">
-              <wp14:pctHeight>0</wp14:pctHeight>
-            </wp14:sizeRelV>
-          </wp:anchor>
-        </w:drawing>
-      </w:r>
-      <w:r>
-        <w:rPr>
-          <w:rFonts w:ascii="Arial" w:hAnsi="Arial" w:cs="Arial"/>
-          <w:b/>
-          <w:bCs/>
-          <w:noProof/>
-          <w:sz w:val="36"/>
-          <w:szCs w:val="36"/>
-          <w:lang w:val="de-DE"/>
-        </w:rPr>
-        <w:drawing>
-          <wp:anchor distT="0" distB="0" distL="114300" distR="114300" simplePos="0" relativeHeight="251670528" behindDoc="0" locked="0" layoutInCell="1" allowOverlap="1" wp14:anchorId="20CD58D8" wp14:editId="0EB7A16C">
-            <wp:simplePos x="0" y="0"/>
-            <wp:positionH relativeFrom="margin">
-              <wp:posOffset>5196840</wp:posOffset>
-            </wp:positionH>
-            <wp:positionV relativeFrom="paragraph">
-              <wp:posOffset>279400</wp:posOffset>
-            </wp:positionV>
-            <wp:extent cx="1508760" cy="1015365"/>
-            <wp:effectExtent l="0" t="0" r="0" b="0"/>
-            <wp:wrapNone/>
-            <wp:docPr id="14093914" name="Picture 4"/>
-            <wp:cNvGraphicFramePr>
-              <a:graphicFrameLocks xmlns:a="http://schemas.openxmlformats.org/drawingml/2006/main" noChangeAspect="1"/>
-            </wp:cNvGraphicFramePr>
-            <a:graphic xmlns:a="http://schemas.openxmlformats.org/drawingml/2006/main">
-              <a:graphicData uri="http://schemas.openxmlformats.org/drawingml/2006/picture">
-                <pic:pic xmlns:pic="http://schemas.openxmlformats.org/drawingml/2006/picture">
-                  <pic:nvPicPr>
-                    <pic:cNvPr id="0" name="Picture 4"/>
-                    <pic:cNvPicPr>
-                      <a:picLocks noChangeAspect="1" noChangeArrowheads="1"/>
-                    </pic:cNvPicPr>
-                  </pic:nvPicPr>
-                  <pic:blipFill>
-                    <a:blip r:embed="rId8" cstate="print">
-                      <a:extLst>
-                        <a:ext uri="{28A0092B-C50C-407E-A947-70E740481C1C}">
-                          <a14:useLocalDpi xmlns:a14="http://schemas.microsoft.com/office/drawing/2010/main" val="0"/>
-                        </a:ext>
-                      </a:extLst>
-                    </a:blip>
-                    <a:srcRect/>
-                    <a:stretch>
-                      <a:fillRect/>
-                    </a:stretch>
-                  </pic:blipFill>
-                  <pic:spPr bwMode="auto">
-                    <a:xfrm>
-                      <a:off x="0" y="0"/>
-                      <a:ext cx="1508760" cy="1015365"/>
-                    </a:xfrm>
-                    <a:prstGeom prst="rect">
-                      <a:avLst/>
-                    </a:prstGeom>
-                    <a:noFill/>
-                    <a:ln>
-                      <a:noFill/>
-                    </a:ln>
-                  </pic:spPr>
-                </pic:pic>
-              </a:graphicData>
-            </a:graphic>
-            <wp14:sizeRelH relativeFrom="page">
-              <wp14:pctWidth>0</wp14:pctWidth>
-            </wp14:sizeRelH>
-            <wp14:sizeRelV relativeFrom="page">
-              <wp14:pctHeight>0</wp14:pctHeight>
-            </wp14:sizeRelV>
-          </wp:anchor>
-        </w:drawing>
-      </w:r>
-      <w:r>
-        <w:rPr>
-          <w:b/>
-          <w:bCs/>
-          <w:noProof/>
         </w:rPr>
         <mc:AlternateContent>
           <mc:Choice Requires="wps">
             <w:drawing>
-              <wp:anchor distT="0" distB="0" distL="114300" distR="114300" simplePos="0" relativeHeight="251663360" behindDoc="0" locked="0" layoutInCell="1" allowOverlap="1" wp14:anchorId="032E7C58" wp14:editId="2CF3595A">
+              <wp:anchor distT="0" distB="0" distL="114300" distR="114300" simplePos="0" relativeHeight="251685888" behindDoc="0" locked="0" layoutInCell="1" allowOverlap="1" wp14:anchorId="408E92CC" wp14:editId="185200B1">
                 <wp:simplePos x="0" y="0"/>
                 <wp:positionH relativeFrom="column">
-                  <wp:posOffset>1734820</wp:posOffset>
+                  <wp:posOffset>5770245</wp:posOffset>
                 </wp:positionH>
                 <wp:positionV relativeFrom="paragraph">
-                  <wp:posOffset>1117600</wp:posOffset>
-                </wp:positionV>
-                <wp:extent cx="1224915" cy="635"/>
-                <wp:effectExtent l="0" t="0" r="0" b="0"/>
-                <wp:wrapNone/>
-                <wp:docPr id="11249692" name="Text Box 1"/>
-                <wp:cNvGraphicFramePr/>
-                <a:graphic xmlns:a="http://schemas.openxmlformats.org/drawingml/2006/main">
-                  <a:graphicData uri="http://schemas.microsoft.com/office/word/2010/wordprocessingShape">
-                    <wps:wsp>
-                      <wps:cNvSpPr txBox="1"/>
-                      <wps:spPr>
-                        <a:xfrm>
-                          <a:off x="0" y="0"/>
-                          <a:ext cx="1224915" cy="635"/>
-                        </a:xfrm>
-                        <a:prstGeom prst="rect">
-                          <a:avLst/>
-                        </a:prstGeom>
-                        <a:solidFill>
-                          <a:prstClr val="white"/>
-                        </a:solidFill>
-                        <a:ln>
-                          <a:noFill/>
-                        </a:ln>
-                      </wps:spPr>
-                      <wps:txbx>
-                        <w:txbxContent>
-                          <w:p>
-                            <w:pPr>
-                              <w:pStyle w:val="Caption"/>
-                              <w:rPr>
-                                <w:rFonts w:ascii="Arial" w:hAnsi="Arial" w:cs="Arial"/>
-                                <w:sz w:val="36"/>
-                                <w:szCs w:val="36"/>
-                                <w:lang w:val="de-DE"/>
-                              </w:rPr>
-                            </w:pPr>
-                            <w:r>
-                              <w:t>Motor</w:t>
-                            </w:r>
-                          </w:p>
-                        </w:txbxContent>
-                      </wps:txbx>
-                      <wps:bodyPr rot="0" spcFirstLastPara="0" vertOverflow="overflow" horzOverflow="overflow" vert="horz" wrap="none" lIns="0" tIns="0" rIns="0" bIns="0" numCol="1" spcCol="0" rtlCol="0" fromWordArt="0" anchor="t" anchorCtr="0" forceAA="0" compatLnSpc="1">
-                        <a:prstTxWarp prst="textNoShape">
-                          <a:avLst/>
-                        </a:prstTxWarp>
-                        <a:spAutoFit/>
-                      </wps:bodyPr>
-                    </wps:wsp>
-                  </a:graphicData>
-                </a:graphic>
-              </wp:anchor>
-            </w:drawing>
-          </mc:Choice>
-          <mc:Fallback>
-            <w:pict>
-              <v:shape w14:anchorId="032E7C58" id="_x0000_s1027" type="#_x0000_t202" style="position:absolute;left:0;text-align:left;margin-left:136.6pt;margin-top:88pt;width:96.45pt;height:.05pt;z-index:251663360;visibility:visible;mso-wrap-style:none;mso-wrap-distance-left:9pt;mso-wrap-distance-top:0;mso-wrap-distance-right:9pt;mso-wrap-distance-bottom:0;mso-position-horizontal:absolute;mso-position-horizontal-relative:text;mso-position-vertical:absolute;mso-position-vertical-relative:text;v-text-anchor:top" o:gfxdata="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" stroked="f">
-                <v:textbox style="mso-fit-shape-to-text:t" inset="0,0,0,0">
-                  <w:txbxContent>
-                    <w:p>
-                      <w:pPr>
-                        <w:pStyle w:val="Caption"/>
-                        <w:rPr>
-                          <w:rFonts w:ascii="Arial" w:hAnsi="Arial" w:cs="Arial"/>
-                          <w:sz w:val="36"/>
-                          <w:szCs w:val="36"/>
-                          <w:lang w:val="de-DE"/>
-                        </w:rPr>
-                      </w:pPr>
-                      <w:r>
-                        <w:t>Motor</w:t>
-                      </w:r>
-                    </w:p>
-                  </w:txbxContent>
-                </v:textbox>
-              </v:shape>
-            </w:pict>
-          </mc:Fallback>
-        </mc:AlternateContent>
-      </w:r>
-      <w:r>
-        <w:rPr>
-          <w:b/>
-          <w:bCs/>
-          <w:noProof/>
-        </w:rPr>
-        <mc:AlternateContent>
-          <mc:Choice Requires="wps">
-            <w:drawing>
-              <wp:anchor distT="0" distB="0" distL="114300" distR="114300" simplePos="0" relativeHeight="251685888" behindDoc="0" locked="0" layoutInCell="1" allowOverlap="1" wp14:anchorId="408E92CC" wp14:editId="168CA71A">
-                <wp:simplePos x="0" y="0"/>
-                <wp:positionH relativeFrom="column">
-                  <wp:posOffset>4182745</wp:posOffset>
-                </wp:positionH>
-                <wp:positionV relativeFrom="paragraph">
-                  <wp:posOffset>1164590</wp:posOffset>
+                  <wp:posOffset>210185</wp:posOffset>
                 </wp:positionV>
                 <wp:extent cx="1828800" cy="635"/>
                 <wp:effectExtent l="0" t="0" r="0" b="0"/>
@@ -578,7 +926,7 @@
           </mc:Choice>
           <mc:Fallback>
             <w:pict>
-              <v:shape w14:anchorId="408E92CC" id="_x0000_s1028" type="#_x0000_t202" style="position:absolute;left:0;text-align:left;margin-left:329.35pt;margin-top:91.7pt;width:2in;height:.05pt;z-index:251685888;visibility:visible;mso-wrap-style:none;mso-wrap-distance-left:9pt;mso-wrap-distance-top:0;mso-wrap-distance-right:9pt;mso-wrap-distance-bottom:0;mso-position-horizontal:absolute;mso-position-horizontal-relative:text;mso-position-vertical:absolute;mso-position-vertical-relative:text;v-text-anchor:top" o:gfxdata="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" stroked="f">
+              <v:shape w14:anchorId="408E92CC" id="_x0000_s1029" type="#_x0000_t202" style="position:absolute;margin-left:454.35pt;margin-top:16.55pt;width:2in;height:.05pt;z-index:251685888;visibility:visible;mso-wrap-style:none;mso-wrap-distance-left:9pt;mso-wrap-distance-top:0;mso-wrap-distance-right:9pt;mso-wrap-distance-bottom:0;mso-position-horizontal:absolute;mso-position-horizontal-relative:text;mso-position-vertical:absolute;mso-position-vertical-relative:text;v-text-anchor:top" o:gfxdata="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" stroked="f">
                 <v:textbox style="mso-fit-shape-to-text:t" inset="0,0,0,0">
                   <w:txbxContent>
                     <w:p>
@@ -603,6 +951,16 @@
           </mc:Fallback>
         </mc:AlternateContent>
       </w:r>
+    </w:p>
+    <w:p>
+      <w:pPr>
+        <w:rPr>
+          <w:rFonts w:ascii="Arial" w:hAnsi="Arial" w:cs="Arial"/>
+          <w:sz w:val="36"/>
+          <w:szCs w:val="36"/>
+          <w:lang w:val="de-DE"/>
+        </w:rPr>
+      </w:pPr>
       <w:r>
         <w:rPr>
           <w:rFonts w:ascii="Arial" w:hAnsi="Arial" w:cs="Arial"/>
@@ -614,18 +972,18 @@
           <w:lang w:val="de-DE"/>
         </w:rPr>
         <w:drawing>
-          <wp:anchor distT="0" distB="0" distL="114300" distR="114300" simplePos="0" relativeHeight="251680768" behindDoc="0" locked="0" layoutInCell="1" allowOverlap="1" wp14:anchorId="5BA65D20" wp14:editId="3EAF1049">
+          <wp:anchor distT="0" distB="0" distL="114300" distR="114300" simplePos="0" relativeHeight="251679744" behindDoc="0" locked="0" layoutInCell="1" allowOverlap="1" wp14:anchorId="4DB16555" wp14:editId="674CD5B2">
             <wp:simplePos x="0" y="0"/>
             <wp:positionH relativeFrom="margin">
-              <wp:posOffset>1136015</wp:posOffset>
+              <wp:align>center</wp:align>
             </wp:positionH>
             <wp:positionV relativeFrom="paragraph">
-              <wp:posOffset>1770380</wp:posOffset>
+              <wp:posOffset>146685</wp:posOffset>
             </wp:positionV>
-            <wp:extent cx="1209040" cy="1209040"/>
+            <wp:extent cx="3814445" cy="1905409"/>
             <wp:effectExtent l="0" t="0" r="0" b="0"/>
             <wp:wrapNone/>
-            <wp:docPr id="1519607816" name="Picture 8"/>
+            <wp:docPr id="403736202" name="Picture 7"/>
             <wp:cNvGraphicFramePr>
               <a:graphicFrameLocks xmlns:a="http://schemas.openxmlformats.org/drawingml/2006/main" noChangeAspect="1"/>
             </wp:cNvGraphicFramePr>
@@ -633,13 +991,13 @@
               <a:graphicData uri="http://schemas.openxmlformats.org/drawingml/2006/picture">
                 <pic:pic xmlns:pic="http://schemas.openxmlformats.org/drawingml/2006/picture">
                   <pic:nvPicPr>
-                    <pic:cNvPr id="0" name="Picture 8"/>
+                    <pic:cNvPr id="0" name="Picture 7"/>
                     <pic:cNvPicPr>
                       <a:picLocks noChangeAspect="1" noChangeArrowheads="1"/>
                     </pic:cNvPicPr>
                   </pic:nvPicPr>
                   <pic:blipFill>
-                    <a:blip r:embed="rId9" cstate="print">
+                    <a:blip r:embed="rId14" cstate="print">
                       <a:extLst>
                         <a:ext uri="{28A0092B-C50C-407E-A947-70E740481C1C}">
                           <a14:useLocalDpi xmlns:a14="http://schemas.microsoft.com/office/drawing/2010/main" val="0"/>
@@ -654,7 +1012,7 @@
                   <pic:spPr bwMode="auto">
                     <a:xfrm>
                       <a:off x="0" y="0"/>
-                      <a:ext cx="1209040" cy="1209040"/>
+                      <a:ext cx="3814445" cy="1905409"/>
                     </a:xfrm>
                     <a:prstGeom prst="rect">
                       <a:avLst/>
@@ -678,176 +1036,23 @@
       </w:r>
       <w:r>
         <w:rPr>
-          <w:rFonts w:ascii="Arial" w:hAnsi="Arial" w:cs="Arial"/>
-          <w:b/>
-          <w:bCs/>
-          <w:noProof/>
-          <w:sz w:val="36"/>
-          <w:szCs w:val="36"/>
-          <w:lang w:val="de-DE"/>
-        </w:rPr>
-        <w:drawing>
-          <wp:anchor distT="0" distB="0" distL="114300" distR="114300" simplePos="0" relativeHeight="251673600" behindDoc="0" locked="0" layoutInCell="1" allowOverlap="1" wp14:anchorId="571EFD0C" wp14:editId="6E8A5206">
-            <wp:simplePos x="0" y="0"/>
-            <wp:positionH relativeFrom="column">
-              <wp:posOffset>-239395</wp:posOffset>
-            </wp:positionH>
-            <wp:positionV relativeFrom="paragraph">
-              <wp:posOffset>1734185</wp:posOffset>
-            </wp:positionV>
-            <wp:extent cx="1507490" cy="1130300"/>
-            <wp:effectExtent l="0" t="0" r="0" b="0"/>
-            <wp:wrapNone/>
-            <wp:docPr id="1846722500" name="Picture 5"/>
-            <wp:cNvGraphicFramePr>
-              <a:graphicFrameLocks xmlns:a="http://schemas.openxmlformats.org/drawingml/2006/main" noChangeAspect="1"/>
-            </wp:cNvGraphicFramePr>
-            <a:graphic xmlns:a="http://schemas.openxmlformats.org/drawingml/2006/main">
-              <a:graphicData uri="http://schemas.openxmlformats.org/drawingml/2006/picture">
-                <pic:pic xmlns:pic="http://schemas.openxmlformats.org/drawingml/2006/picture">
-                  <pic:nvPicPr>
-                    <pic:cNvPr id="0" name="Picture 5"/>
-                    <pic:cNvPicPr>
-                      <a:picLocks noChangeAspect="1" noChangeArrowheads="1"/>
-                    </pic:cNvPicPr>
-                  </pic:nvPicPr>
-                  <pic:blipFill>
-                    <a:blip r:embed="rId10" cstate="print">
-                      <a:extLst>
-                        <a:ext uri="{28A0092B-C50C-407E-A947-70E740481C1C}">
-                          <a14:useLocalDpi xmlns:a14="http://schemas.microsoft.com/office/drawing/2010/main" val="0"/>
-                        </a:ext>
-                      </a:extLst>
-                    </a:blip>
-                    <a:srcRect/>
-                    <a:stretch>
-                      <a:fillRect/>
-                    </a:stretch>
-                  </pic:blipFill>
-                  <pic:spPr bwMode="auto">
-                    <a:xfrm>
-                      <a:off x="0" y="0"/>
-                      <a:ext cx="1507490" cy="1130300"/>
-                    </a:xfrm>
-                    <a:prstGeom prst="rect">
-                      <a:avLst/>
-                    </a:prstGeom>
-                    <a:noFill/>
-                    <a:ln>
-                      <a:noFill/>
-                    </a:ln>
-                  </pic:spPr>
-                </pic:pic>
-              </a:graphicData>
-            </a:graphic>
-            <wp14:sizeRelH relativeFrom="page">
-              <wp14:pctWidth>0</wp14:pctWidth>
-            </wp14:sizeRelH>
-            <wp14:sizeRelV relativeFrom="page">
-              <wp14:pctHeight>0</wp14:pctHeight>
-            </wp14:sizeRelV>
-          </wp:anchor>
-        </w:drawing>
-      </w:r>
-      <w:r>
-        <w:rPr>
-          <w:rFonts w:ascii="Arial" w:hAnsi="Arial" w:cs="Arial"/>
-          <w:b/>
-          <w:bCs/>
-          <w:noProof/>
-          <w:sz w:val="32"/>
-          <w:szCs w:val="32"/>
-          <w:lang w:val="de-DE"/>
-        </w:rPr>
-        <w:drawing>
-          <wp:anchor distT="0" distB="0" distL="114300" distR="114300" simplePos="0" relativeHeight="251658240" behindDoc="0" locked="0" layoutInCell="1" allowOverlap="1" wp14:anchorId="6BB2ADC5" wp14:editId="539AA3CA">
-            <wp:simplePos x="0" y="0"/>
-            <wp:positionH relativeFrom="column">
-              <wp:posOffset>-7620</wp:posOffset>
-            </wp:positionH>
-            <wp:positionV relativeFrom="paragraph">
-              <wp:posOffset>311785</wp:posOffset>
-            </wp:positionV>
-            <wp:extent cx="1275080" cy="1052830"/>
-            <wp:effectExtent l="0" t="0" r="1270" b="0"/>
-            <wp:wrapNone/>
-            <wp:docPr id="2032397776" name="Picture 1"/>
-            <wp:cNvGraphicFramePr>
-              <a:graphicFrameLocks xmlns:a="http://schemas.openxmlformats.org/drawingml/2006/main" noChangeAspect="1"/>
-            </wp:cNvGraphicFramePr>
-            <a:graphic xmlns:a="http://schemas.openxmlformats.org/drawingml/2006/main">
-              <a:graphicData uri="http://schemas.openxmlformats.org/drawingml/2006/picture">
-                <pic:pic xmlns:pic="http://schemas.openxmlformats.org/drawingml/2006/picture">
-                  <pic:nvPicPr>
-                    <pic:cNvPr id="0" name="Picture 1"/>
-                    <pic:cNvPicPr>
-                      <a:picLocks noChangeAspect="1" noChangeArrowheads="1"/>
-                    </pic:cNvPicPr>
-                  </pic:nvPicPr>
-                  <pic:blipFill rotWithShape="1">
-                    <a:blip r:embed="rId11" cstate="print">
-                      <a:extLst>
-                        <a:ext uri="{28A0092B-C50C-407E-A947-70E740481C1C}">
-                          <a14:useLocalDpi xmlns:a14="http://schemas.microsoft.com/office/drawing/2010/main" val="0"/>
-                        </a:ext>
-                      </a:extLst>
-                    </a:blip>
-                    <a:srcRect l="12342" t="21065" r="21700" b="24460"/>
-                    <a:stretch>
-                      <a:fillRect/>
-                    </a:stretch>
-                  </pic:blipFill>
-                  <pic:spPr bwMode="auto">
-                    <a:xfrm>
-                      <a:off x="0" y="0"/>
-                      <a:ext cx="1275080" cy="1052830"/>
-                    </a:xfrm>
-                    <a:prstGeom prst="rect">
-                      <a:avLst/>
-                    </a:prstGeom>
-                    <a:noFill/>
-                    <a:ln>
-                      <a:noFill/>
-                    </a:ln>
-                    <a:extLst>
-                      <a:ext uri="{53640926-AAD7-44D8-BBD7-CCE9431645EC}">
-                        <a14:shadowObscured xmlns:a14="http://schemas.microsoft.com/office/drawing/2010/main"/>
-                      </a:ext>
-                    </a:extLst>
-                  </pic:spPr>
-                </pic:pic>
-              </a:graphicData>
-            </a:graphic>
-            <wp14:sizeRelH relativeFrom="page">
-              <wp14:pctWidth>0</wp14:pctWidth>
-            </wp14:sizeRelH>
-            <wp14:sizeRelV relativeFrom="page">
-              <wp14:pctHeight>0</wp14:pctHeight>
-            </wp14:sizeRelV>
-          </wp:anchor>
-        </w:drawing>
-      </w:r>
-      <w:r>
-        <w:rPr>
-          <w:b/>
-          <w:bCs/>
           <w:noProof/>
         </w:rPr>
         <mc:AlternateContent>
           <mc:Choice Requires="wps">
             <w:drawing>
-              <wp:anchor distT="0" distB="0" distL="114300" distR="114300" simplePos="0" relativeHeight="251675648" behindDoc="0" locked="0" layoutInCell="1" allowOverlap="1" wp14:anchorId="25C2E489" wp14:editId="7320FD19">
+              <wp:anchor distT="0" distB="0" distL="114300" distR="114300" simplePos="0" relativeHeight="251682816" behindDoc="0" locked="0" layoutInCell="1" allowOverlap="1" wp14:anchorId="18956FD3" wp14:editId="05E79D84">
                 <wp:simplePos x="0" y="0"/>
-                <wp:positionH relativeFrom="margin">
-                  <wp:posOffset>345440</wp:posOffset>
+                <wp:positionH relativeFrom="column">
+                  <wp:posOffset>1990090</wp:posOffset>
                 </wp:positionH>
                 <wp:positionV relativeFrom="paragraph">
-                  <wp:posOffset>2896870</wp:posOffset>
+                  <wp:posOffset>245745</wp:posOffset>
                 </wp:positionV>
-                <wp:extent cx="1507490" cy="635"/>
-                <wp:effectExtent l="0" t="0" r="8890" b="0"/>
+                <wp:extent cx="1209040" cy="635"/>
+                <wp:effectExtent l="0" t="0" r="0" b="0"/>
                 <wp:wrapNone/>
-                <wp:docPr id="1937947356" name="Text Box 1"/>
+                <wp:docPr id="1078831630" name="Text Box 1"/>
                 <wp:cNvGraphicFramePr/>
                 <a:graphic xmlns:a="http://schemas.openxmlformats.org/drawingml/2006/main">
                   <a:graphicData uri="http://schemas.microsoft.com/office/word/2010/wordprocessingShape">
@@ -856,7 +1061,7 @@
                       <wps:spPr>
                         <a:xfrm>
                           <a:off x="0" y="0"/>
-                          <a:ext cx="1507490" cy="635"/>
+                          <a:ext cx="1209040" cy="635"/>
                         </a:xfrm>
                         <a:prstGeom prst="rect">
                           <a:avLst/>
@@ -882,7 +1087,7 @@
                               </w:rPr>
                             </w:pPr>
                             <w:r>
-                              <w:t>K170P</w:t>
+                              <w:t>Rad</w:t>
                             </w:r>
                           </w:p>
                         </w:txbxContent>
@@ -901,7 +1106,7 @@
           </mc:Choice>
           <mc:Fallback>
             <w:pict>
-              <v:shape w14:anchorId="25C2E489" id="_x0000_s1029" type="#_x0000_t202" style="position:absolute;left:0;text-align:left;margin-left:27.2pt;margin-top:228.1pt;width:118.7pt;height:.05pt;z-index:251675648;visibility:visible;mso-wrap-style:none;mso-wrap-distance-left:9pt;mso-wrap-distance-top:0;mso-wrap-distance-right:9pt;mso-wrap-distance-bottom:0;mso-position-horizontal:absolute;mso-position-horizontal-relative:margin;mso-position-vertical:absolute;mso-position-vertical-relative:text;v-text-anchor:top" o:gfxdata="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" stroked="f">
+              <v:shape w14:anchorId="18956FD3" id="_x0000_s1030" type="#_x0000_t202" style="position:absolute;margin-left:156.7pt;margin-top:19.35pt;width:95.2pt;height:.05pt;z-index:251682816;visibility:visible;mso-wrap-style:none;mso-wrap-distance-left:9pt;mso-wrap-distance-top:0;mso-wrap-distance-right:9pt;mso-wrap-distance-bottom:0;mso-position-horizontal:absolute;mso-position-horizontal-relative:text;mso-position-vertical:absolute;mso-position-vertical-relative:text;v-text-anchor:top" o:gfxdata="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" stroked="f">
                 <v:textbox style="mso-fit-shape-to-text:t" inset="0,0,0,0">
                   <w:txbxContent>
                     <w:p>
@@ -916,326 +1121,7 @@
                         </w:rPr>
                       </w:pPr>
                       <w:r>
-                        <w:t>K170P</w:t>
-                      </w:r>
-                    </w:p>
-                  </w:txbxContent>
-                </v:textbox>
-                <w10:wrap anchorx="margin"/>
-              </v:shape>
-            </w:pict>
-          </mc:Fallback>
-        </mc:AlternateContent>
-      </w:r>
-      <w:r>
-        <w:rPr>
-          <w:rFonts w:ascii="Arial" w:hAnsi="Arial" w:cs="Arial"/>
-          <w:b/>
-          <w:bCs/>
-          <w:sz w:val="36"/>
-          <w:szCs w:val="36"/>
-          <w:lang w:val="de-DE"/>
-        </w:rPr>
-        <w:drawing>
-          <wp:anchor distT="0" distB="0" distL="114300" distR="114300" simplePos="0" relativeHeight="251661312" behindDoc="0" locked="0" layoutInCell="1" allowOverlap="1" wp14:anchorId="1F2AA36A" wp14:editId="26F75387">
-            <wp:simplePos x="0" y="0"/>
-            <wp:positionH relativeFrom="column">
-              <wp:posOffset>1317625</wp:posOffset>
-            </wp:positionH>
-            <wp:positionV relativeFrom="paragraph">
-              <wp:posOffset>278765</wp:posOffset>
-            </wp:positionV>
-            <wp:extent cx="1224915" cy="791210"/>
-            <wp:effectExtent l="0" t="0" r="0" b="8890"/>
-            <wp:wrapNone/>
-            <wp:docPr id="654899550" name="Picture 1"/>
-            <wp:cNvGraphicFramePr>
-              <a:graphicFrameLocks xmlns:a="http://schemas.openxmlformats.org/drawingml/2006/main" noChangeAspect="1"/>
-            </wp:cNvGraphicFramePr>
-            <a:graphic xmlns:a="http://schemas.openxmlformats.org/drawingml/2006/main">
-              <a:graphicData uri="http://schemas.openxmlformats.org/drawingml/2006/picture">
-                <pic:pic xmlns:pic="http://schemas.openxmlformats.org/drawingml/2006/picture">
-                  <pic:nvPicPr>
-                    <pic:cNvPr id="654899550" name=""/>
-                    <pic:cNvPicPr/>
-                  </pic:nvPicPr>
-                  <pic:blipFill>
-                    <a:blip r:embed="rId12" cstate="print">
-                      <a:extLst>
-                        <a:ext uri="{28A0092B-C50C-407E-A947-70E740481C1C}">
-                          <a14:useLocalDpi xmlns:a14="http://schemas.microsoft.com/office/drawing/2010/main" val="0"/>
-                        </a:ext>
-                      </a:extLst>
-                    </a:blip>
-                    <a:stretch>
-                      <a:fillRect/>
-                    </a:stretch>
-                  </pic:blipFill>
-                  <pic:spPr>
-                    <a:xfrm>
-                      <a:off x="0" y="0"/>
-                      <a:ext cx="1224915" cy="791210"/>
-                    </a:xfrm>
-                    <a:prstGeom prst="rect">
-                      <a:avLst/>
-                    </a:prstGeom>
-                  </pic:spPr>
-                </pic:pic>
-              </a:graphicData>
-            </a:graphic>
-            <wp14:sizeRelH relativeFrom="page">
-              <wp14:pctWidth>0</wp14:pctWidth>
-            </wp14:sizeRelH>
-            <wp14:sizeRelV relativeFrom="page">
-              <wp14:pctHeight>0</wp14:pctHeight>
-            </wp14:sizeRelV>
-          </wp:anchor>
-        </w:drawing>
-      </w:r>
-      <w:r>
-        <w:rPr>
-          <w:rFonts w:ascii="Arial" w:hAnsi="Arial" w:cs="Arial"/>
-          <w:b/>
-          <w:bCs/>
-          <w:noProof/>
-          <w:sz w:val="36"/>
-          <w:szCs w:val="36"/>
-          <w:lang w:val="de-DE"/>
-        </w:rPr>
-        <w:drawing>
-          <wp:anchor distT="0" distB="0" distL="114300" distR="114300" simplePos="0" relativeHeight="251679744" behindDoc="0" locked="0" layoutInCell="1" allowOverlap="1" wp14:anchorId="4DB16555" wp14:editId="596C024A">
-            <wp:simplePos x="0" y="0"/>
-            <wp:positionH relativeFrom="margin">
-              <wp:posOffset>2240280</wp:posOffset>
-            </wp:positionH>
-            <wp:positionV relativeFrom="paragraph">
-              <wp:posOffset>1614170</wp:posOffset>
-            </wp:positionV>
-            <wp:extent cx="3338195" cy="1667510"/>
-            <wp:effectExtent l="0" t="0" r="0" b="8890"/>
-            <wp:wrapNone/>
-            <wp:docPr id="403736202" name="Picture 7"/>
-            <wp:cNvGraphicFramePr>
-              <a:graphicFrameLocks xmlns:a="http://schemas.openxmlformats.org/drawingml/2006/main" noChangeAspect="1"/>
-            </wp:cNvGraphicFramePr>
-            <a:graphic xmlns:a="http://schemas.openxmlformats.org/drawingml/2006/main">
-              <a:graphicData uri="http://schemas.openxmlformats.org/drawingml/2006/picture">
-                <pic:pic xmlns:pic="http://schemas.openxmlformats.org/drawingml/2006/picture">
-                  <pic:nvPicPr>
-                    <pic:cNvPr id="0" name="Picture 7"/>
-                    <pic:cNvPicPr>
-                      <a:picLocks noChangeAspect="1" noChangeArrowheads="1"/>
-                    </pic:cNvPicPr>
-                  </pic:nvPicPr>
-                  <pic:blipFill>
-                    <a:blip r:embed="rId13" cstate="print">
-                      <a:extLst>
-                        <a:ext uri="{28A0092B-C50C-407E-A947-70E740481C1C}">
-                          <a14:useLocalDpi xmlns:a14="http://schemas.microsoft.com/office/drawing/2010/main" val="0"/>
-                        </a:ext>
-                      </a:extLst>
-                    </a:blip>
-                    <a:srcRect/>
-                    <a:stretch>
-                      <a:fillRect/>
-                    </a:stretch>
-                  </pic:blipFill>
-                  <pic:spPr bwMode="auto">
-                    <a:xfrm>
-                      <a:off x="0" y="0"/>
-                      <a:ext cx="3338195" cy="1667510"/>
-                    </a:xfrm>
-                    <a:prstGeom prst="rect">
-                      <a:avLst/>
-                    </a:prstGeom>
-                    <a:noFill/>
-                    <a:ln>
-                      <a:noFill/>
-                    </a:ln>
-                  </pic:spPr>
-                </pic:pic>
-              </a:graphicData>
-            </a:graphic>
-            <wp14:sizeRelH relativeFrom="page">
-              <wp14:pctWidth>0</wp14:pctWidth>
-            </wp14:sizeRelH>
-            <wp14:sizeRelV relativeFrom="page">
-              <wp14:pctHeight>0</wp14:pctHeight>
-            </wp14:sizeRelV>
-          </wp:anchor>
-        </w:drawing>
-      </w:r>
-      <w:r>
-        <w:rPr>
-          <w:rFonts w:ascii="Arial" w:hAnsi="Arial" w:cs="Arial"/>
-          <w:b/>
-          <w:bCs/>
-          <w:sz w:val="32"/>
-          <w:szCs w:val="32"/>
-          <w:lang w:val="de-DE"/>
-        </w:rPr>
-        <w:t>Bauteile</w:t>
-      </w:r>
-    </w:p>
-    <w:p>
-      <w:pPr>
-        <w:rPr>
-          <w:rFonts w:ascii="Arial" w:hAnsi="Arial" w:cs="Arial"/>
-          <w:sz w:val="36"/>
-          <w:szCs w:val="36"/>
-          <w:lang w:val="de-DE"/>
-        </w:rPr>
-      </w:pPr>
-    </w:p>
-    <w:p>
-      <w:pPr>
-        <w:rPr>
-          <w:rFonts w:ascii="Arial" w:hAnsi="Arial" w:cs="Arial"/>
-          <w:sz w:val="36"/>
-          <w:szCs w:val="36"/>
-          <w:lang w:val="de-DE"/>
-        </w:rPr>
-      </w:pPr>
-    </w:p>
-    <w:p>
-      <w:pPr>
-        <w:rPr>
-          <w:rFonts w:ascii="Arial" w:hAnsi="Arial" w:cs="Arial"/>
-          <w:sz w:val="36"/>
-          <w:szCs w:val="36"/>
-          <w:lang w:val="de-DE"/>
-        </w:rPr>
-      </w:pPr>
-      <w:r>
-        <w:rPr>
-          <w:noProof/>
-        </w:rPr>
-        <mc:AlternateContent>
-          <mc:Choice Requires="wps">
-            <w:drawing>
-              <wp:anchor distT="0" distB="0" distL="114300" distR="114300" simplePos="0" relativeHeight="251672576" behindDoc="0" locked="0" layoutInCell="1" allowOverlap="1" wp14:anchorId="2D511769" wp14:editId="10557FEE">
-                <wp:simplePos x="0" y="0"/>
-                <wp:positionH relativeFrom="column">
-                  <wp:posOffset>5417185</wp:posOffset>
-                </wp:positionH>
-                <wp:positionV relativeFrom="paragraph">
-                  <wp:posOffset>154940</wp:posOffset>
-                </wp:positionV>
-                <wp:extent cx="1833880" cy="635"/>
-                <wp:effectExtent l="0" t="0" r="0" b="0"/>
-                <wp:wrapNone/>
-                <wp:docPr id="1264492098" name="Text Box 1"/>
-                <wp:cNvGraphicFramePr/>
-                <a:graphic xmlns:a="http://schemas.openxmlformats.org/drawingml/2006/main">
-                  <a:graphicData uri="http://schemas.microsoft.com/office/word/2010/wordprocessingShape">
-                    <wps:wsp>
-                      <wps:cNvSpPr txBox="1"/>
-                      <wps:spPr>
-                        <a:xfrm>
-                          <a:off x="0" y="0"/>
-                          <a:ext cx="1833880" cy="635"/>
-                        </a:xfrm>
-                        <a:prstGeom prst="rect">
-                          <a:avLst/>
-                        </a:prstGeom>
-                        <a:solidFill>
-                          <a:prstClr val="white"/>
-                        </a:solidFill>
-                        <a:ln>
-                          <a:noFill/>
-                        </a:ln>
-                      </wps:spPr>
-                      <wps:txbx>
-                        <w:txbxContent>
-                          <w:p>
-                            <w:pPr>
-                              <w:pStyle w:val="Caption"/>
-                              <w:rPr>
-                                <w:rFonts w:ascii="Arial" w:hAnsi="Arial" w:cs="Arial"/>
-                                <w:noProof/>
-                                <w:sz w:val="36"/>
-                                <w:szCs w:val="36"/>
-                                <w:lang w:val="de-DE"/>
-                              </w:rPr>
-                            </w:pPr>
-                            <w:r>
-                              <w:rPr>
-                                <w:lang w:val="de-DE"/>
-                              </w:rPr>
-                              <w:t>USB-B</w:t>
-                            </w:r>
-                            <w:r>
-                              <w:rPr>
-                                <w:lang w:val="de-DE"/>
-                              </w:rPr>
-                              <w:t xml:space="preserve"> auf USB-A</w:t>
-                            </w:r>
-                            <w:r>
-                              <w:rPr>
-                                <w:lang w:val="de-DE"/>
-                              </w:rPr>
-                              <w:t xml:space="preserve"> </w:t>
-                            </w:r>
-                            <w:r>
-                              <w:rPr>
-                                <w:lang w:val="de-DE"/>
-                              </w:rPr>
-                              <w:t>Kabel</w:t>
-                            </w:r>
-                          </w:p>
-                        </w:txbxContent>
-                      </wps:txbx>
-                      <wps:bodyPr rot="0" spcFirstLastPara="0" vertOverflow="overflow" horzOverflow="overflow" vert="horz" wrap="none" lIns="0" tIns="0" rIns="0" bIns="0" numCol="1" spcCol="0" rtlCol="0" fromWordArt="0" anchor="t" anchorCtr="0" forceAA="0" compatLnSpc="1">
-                        <a:prstTxWarp prst="textNoShape">
-                          <a:avLst/>
-                        </a:prstTxWarp>
-                        <a:spAutoFit/>
-                      </wps:bodyPr>
-                    </wps:wsp>
-                  </a:graphicData>
-                </a:graphic>
-              </wp:anchor>
-            </w:drawing>
-          </mc:Choice>
-          <mc:Fallback>
-            <w:pict>
-              <v:shape w14:anchorId="2D511769" id="_x0000_s1030" type="#_x0000_t202" style="position:absolute;margin-left:426.55pt;margin-top:12.2pt;width:144.4pt;height:.05pt;z-index:251672576;visibility:visible;mso-wrap-style:none;mso-wrap-distance-left:9pt;mso-wrap-distance-top:0;mso-wrap-distance-right:9pt;mso-wrap-distance-bottom:0;mso-position-horizontal:absolute;mso-position-horizontal-relative:text;mso-position-vertical:absolute;mso-position-vertical-relative:text;v-text-anchor:top" o:gfxdata="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" stroked="f">
-                <v:textbox style="mso-fit-shape-to-text:t" inset="0,0,0,0">
-                  <w:txbxContent>
-                    <w:p>
-                      <w:pPr>
-                        <w:pStyle w:val="Caption"/>
-                        <w:rPr>
-                          <w:rFonts w:ascii="Arial" w:hAnsi="Arial" w:cs="Arial"/>
-                          <w:noProof/>
-                          <w:sz w:val="36"/>
-                          <w:szCs w:val="36"/>
-                          <w:lang w:val="de-DE"/>
-                        </w:rPr>
-                      </w:pPr>
-                      <w:r>
-                        <w:rPr>
-                          <w:lang w:val="de-DE"/>
-                        </w:rPr>
-                        <w:t>USB-B</w:t>
-                      </w:r>
-                      <w:r>
-                        <w:rPr>
-                          <w:lang w:val="de-DE"/>
-                        </w:rPr>
-                        <w:t xml:space="preserve"> auf USB-A</w:t>
-                      </w:r>
-                      <w:r>
-                        <w:rPr>
-                          <w:lang w:val="de-DE"/>
-                        </w:rPr>
-                        <w:t xml:space="preserve"> </w:t>
-                      </w:r>
-                      <w:r>
-                        <w:rPr>
-                          <w:lang w:val="de-DE"/>
-                        </w:rPr>
-                        <w:t>Kabel</w:t>
+                        <w:t>Rad</w:t>
                       </w:r>
                     </w:p>
                   </w:txbxContent>
@@ -1252,13 +1138,13 @@
         <mc:AlternateContent>
           <mc:Choice Requires="wps">
             <w:drawing>
-              <wp:anchor distT="0" distB="0" distL="114300" distR="114300" simplePos="0" relativeHeight="251660288" behindDoc="0" locked="0" layoutInCell="1" allowOverlap="1" wp14:anchorId="1F2719EB" wp14:editId="361FE04A">
+              <wp:anchor distT="0" distB="0" distL="114300" distR="114300" simplePos="0" relativeHeight="251660288" behindDoc="0" locked="0" layoutInCell="1" allowOverlap="1" wp14:anchorId="1F2719EB" wp14:editId="02F27643">
                 <wp:simplePos x="0" y="0"/>
                 <wp:positionH relativeFrom="margin">
-                  <wp:align>left</wp:align>
+                  <wp:posOffset>50800</wp:posOffset>
                 </wp:positionH>
                 <wp:positionV relativeFrom="paragraph">
-                  <wp:posOffset>261620</wp:posOffset>
+                  <wp:posOffset>223520</wp:posOffset>
                 </wp:positionV>
                 <wp:extent cx="1694815" cy="635"/>
                 <wp:effectExtent l="0" t="0" r="4445" b="0"/>
@@ -1324,7 +1210,7 @@
           </mc:Choice>
           <mc:Fallback>
             <w:pict>
-              <v:shape w14:anchorId="1F2719EB" id="_x0000_s1031" type="#_x0000_t202" style="position:absolute;margin-left:0;margin-top:20.6pt;width:133.45pt;height:.05pt;z-index:251660288;visibility:visible;mso-wrap-style:none;mso-wrap-distance-left:9pt;mso-wrap-distance-top:0;mso-wrap-distance-right:9pt;mso-wrap-distance-bottom:0;mso-position-horizontal:left;mso-position-horizontal-relative:margin;mso-position-vertical:absolute;mso-position-vertical-relative:text;v-text-anchor:top" o:gfxdata="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" stroked="f">
+              <v:shape w14:anchorId="1F2719EB" id="_x0000_s1031" type="#_x0000_t202" style="position:absolute;margin-left:4pt;margin-top:17.6pt;width:133.45pt;height:.05pt;z-index:251660288;visibility:visible;mso-wrap-style:none;mso-wrap-distance-left:9pt;mso-wrap-distance-top:0;mso-wrap-distance-right:9pt;mso-wrap-distance-bottom:0;mso-position-horizontal:absolute;mso-position-horizontal-relative:margin;mso-position-vertical:absolute;mso-position-vertical-relative:text;v-text-anchor:top" o:gfxdata="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" stroked="f">
                 <v:textbox style="mso-fit-shape-to-text:t" inset="0,0,0,0">
                   <w:txbxContent>
                     <w:p>
@@ -1367,26 +1253,6 @@
           <w:lang w:val="de-DE"/>
         </w:rPr>
       </w:pPr>
-    </w:p>
-    <w:p>
-      <w:pPr>
-        <w:rPr>
-          <w:rFonts w:ascii="Arial" w:hAnsi="Arial" w:cs="Arial"/>
-          <w:sz w:val="36"/>
-          <w:szCs w:val="36"/>
-          <w:lang w:val="de-DE"/>
-        </w:rPr>
-      </w:pPr>
-    </w:p>
-    <w:p>
-      <w:pPr>
-        <w:rPr>
-          <w:rFonts w:ascii="Arial" w:hAnsi="Arial" w:cs="Arial"/>
-          <w:sz w:val="36"/>
-          <w:szCs w:val="36"/>
-          <w:lang w:val="de-DE"/>
-        </w:rPr>
-      </w:pPr>
       <w:r>
         <w:rPr>
           <w:noProof/>
@@ -1394,17 +1260,25 @@
         <mc:AlternateContent>
           <mc:Choice Requires="wps">
             <w:drawing>
-              <wp:anchor distT="0" distB="0" distL="114300" distR="114300" simplePos="0" relativeHeight="251678720" behindDoc="0" locked="0" layoutInCell="1" allowOverlap="1" wp14:anchorId="24D2D7D2" wp14:editId="797DF9EB">
+              <wp:anchor distT="0" distB="0" distL="114300" distR="114300" simplePos="0" relativeHeight="251678720" behindDoc="1" locked="0" layoutInCell="1" allowOverlap="1" wp14:anchorId="24D2D7D2" wp14:editId="68BF39A7">
                 <wp:simplePos x="0" y="0"/>
                 <wp:positionH relativeFrom="column">
-                  <wp:posOffset>5003165</wp:posOffset>
+                  <wp:posOffset>5308600</wp:posOffset>
                 </wp:positionH>
                 <wp:positionV relativeFrom="paragraph">
-                  <wp:posOffset>140970</wp:posOffset>
+                  <wp:posOffset>160020</wp:posOffset>
                 </wp:positionV>
                 <wp:extent cx="3268345" cy="635"/>
-                <wp:effectExtent l="0" t="0" r="8255" b="0"/>
-                <wp:wrapNone/>
+                <wp:effectExtent l="0" t="0" r="3175" b="3810"/>
+                <wp:wrapTight wrapText="bothSides">
+                  <wp:wrapPolygon edited="0">
+                    <wp:start x="0" y="0"/>
+                    <wp:lineTo x="0" y="21363"/>
+                    <wp:lineTo x="21406" y="21363"/>
+                    <wp:lineTo x="21406" y="0"/>
+                    <wp:lineTo x="0" y="0"/>
+                  </wp:wrapPolygon>
+                </wp:wrapTight>
                 <wp:docPr id="1474635277" name="Text Box 1"/>
                 <wp:cNvGraphicFramePr/>
                 <a:graphic xmlns:a="http://schemas.openxmlformats.org/drawingml/2006/main">
@@ -1434,16 +1308,16 @@
                               <w:rPr>
                                 <w:i w:val="0"/>
                                 <w:iCs w:val="0"/>
-                                <w:sz w:val="24"/>
-                                <w:szCs w:val="24"/>
+                                <w:sz w:val="22"/>
+                                <w:szCs w:val="22"/>
                               </w:rPr>
                             </w:pPr>
                             <w:r>
                               <w:rPr>
                                 <w:i w:val="0"/>
                                 <w:iCs w:val="0"/>
-                                <w:sz w:val="24"/>
-                                <w:szCs w:val="24"/>
+                                <w:sz w:val="22"/>
+                                <w:szCs w:val="22"/>
                               </w:rPr>
                               <w:t>3D</w:t>
                             </w:r>
@@ -1451,8 +1325,8 @@
                               <w:rPr>
                                 <w:i w:val="0"/>
                                 <w:iCs w:val="0"/>
-                                <w:sz w:val="24"/>
-                                <w:szCs w:val="24"/>
+                                <w:sz w:val="22"/>
+                                <w:szCs w:val="22"/>
                               </w:rPr>
                               <w:t>-</w:t>
                             </w:r>
@@ -1460,8 +1334,8 @@
                               <w:rPr>
                                 <w:i w:val="0"/>
                                 <w:iCs w:val="0"/>
-                                <w:sz w:val="24"/>
-                                <w:szCs w:val="24"/>
+                                <w:sz w:val="22"/>
+                                <w:szCs w:val="22"/>
                               </w:rPr>
                               <w:t>Bauteile:</w:t>
                             </w:r>
@@ -1474,15 +1348,15 @@
                                 <w:numId w:val="2"/>
                               </w:numPr>
                               <w:rPr>
-                                <w:sz w:val="20"/>
-                                <w:szCs w:val="20"/>
+                                <w:sz w:val="22"/>
+                                <w:szCs w:val="22"/>
                                 <w:lang w:val="de-DE"/>
                               </w:rPr>
                             </w:pPr>
                             <w:r>
                               <w:rPr>
-                                <w:sz w:val="20"/>
-                                <w:szCs w:val="20"/>
+                                <w:sz w:val="22"/>
+                                <w:szCs w:val="22"/>
                                 <w:lang w:val="de-DE"/>
                               </w:rPr>
                               <w:t>Motor-Halterung</w:t>
@@ -1496,18 +1370,18 @@
                                 <w:numId w:val="2"/>
                               </w:numPr>
                               <w:rPr>
-                                <w:sz w:val="20"/>
-                                <w:szCs w:val="20"/>
+                                <w:sz w:val="22"/>
+                                <w:szCs w:val="22"/>
                                 <w:lang w:val="de-DE"/>
                               </w:rPr>
                             </w:pPr>
                             <w:r>
                               <w:rPr>
-                                <w:sz w:val="20"/>
-                                <w:szCs w:val="20"/>
+                                <w:sz w:val="22"/>
+                                <w:szCs w:val="22"/>
                                 <w:lang w:val="de-DE"/>
                               </w:rPr>
-                              <w:t>Powerbank-Halterung</w:t>
+                              <w:t>Basis</w:t>
                             </w:r>
                           </w:p>
                           <w:p>
@@ -1518,15 +1392,15 @@
                                 <w:numId w:val="2"/>
                               </w:numPr>
                               <w:rPr>
-                                <w:sz w:val="20"/>
-                                <w:szCs w:val="20"/>
+                                <w:sz w:val="22"/>
+                                <w:szCs w:val="22"/>
                                 <w:lang w:val="de-DE"/>
                               </w:rPr>
                             </w:pPr>
                             <w:r>
                               <w:rPr>
-                                <w:sz w:val="20"/>
-                                <w:szCs w:val="20"/>
+                                <w:sz w:val="22"/>
+                                <w:szCs w:val="22"/>
                                 <w:lang w:val="de-DE"/>
                               </w:rPr>
                               <w:t>Fuß</w:t>
@@ -1540,18 +1414,28 @@
                                 <w:numId w:val="2"/>
                               </w:numPr>
                               <w:rPr>
-                                <w:sz w:val="20"/>
-                                <w:szCs w:val="20"/>
+                                <w:sz w:val="22"/>
+                                <w:szCs w:val="22"/>
                                 <w:lang w:val="de-DE"/>
                               </w:rPr>
                             </w:pPr>
+                            <w:proofErr w:type="spellStart"/>
                             <w:r>
                               <w:rPr>
-                                <w:sz w:val="20"/>
-                                <w:szCs w:val="20"/>
+                                <w:sz w:val="22"/>
+                                <w:szCs w:val="22"/>
                                 <w:lang w:val="de-DE"/>
                               </w:rPr>
-                              <w:t>ToF-Halterung</w:t>
+                              <w:t>ToF</w:t>
+                            </w:r>
+                            <w:proofErr w:type="spellEnd"/>
+                            <w:r>
+                              <w:rPr>
+                                <w:sz w:val="22"/>
+                                <w:szCs w:val="22"/>
+                                <w:lang w:val="de-DE"/>
+                              </w:rPr>
+                              <w:t>-Halterung</w:t>
                             </w:r>
                           </w:p>
                           <w:p>
@@ -1562,15 +1446,15 @@
                                 <w:numId w:val="2"/>
                               </w:numPr>
                               <w:rPr>
-                                <w:sz w:val="20"/>
-                                <w:szCs w:val="20"/>
+                                <w:sz w:val="22"/>
+                                <w:szCs w:val="22"/>
                                 <w:lang w:val="de-DE"/>
                               </w:rPr>
                             </w:pPr>
                             <w:r>
                               <w:rPr>
-                                <w:sz w:val="20"/>
-                                <w:szCs w:val="20"/>
+                                <w:sz w:val="22"/>
+                                <w:szCs w:val="22"/>
                                 <w:lang w:val="de-DE"/>
                               </w:rPr>
                               <w:t>PCB-Halterung</w:t>
@@ -1592,7 +1476,7 @@
           </mc:Choice>
           <mc:Fallback>
             <w:pict>
-              <v:shape w14:anchorId="24D2D7D2" id="_x0000_s1032" type="#_x0000_t202" style="position:absolute;margin-left:393.95pt;margin-top:11.1pt;width:257.35pt;height:.05pt;z-index:251678720;visibility:visible;mso-wrap-style:none;mso-wrap-distance-left:9pt;mso-wrap-distance-top:0;mso-wrap-distance-right:9pt;mso-wrap-distance-bottom:0;mso-position-horizontal:absolute;mso-position-horizontal-relative:text;mso-position-vertical:absolute;mso-position-vertical-relative:text;v-text-anchor:top" o:gfxdata="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" stroked="f">
+              <v:shape w14:anchorId="24D2D7D2" id="_x0000_s1032" type="#_x0000_t202" style="position:absolute;margin-left:418pt;margin-top:12.6pt;width:257.35pt;height:.05pt;z-index:-251637760;visibility:visible;mso-wrap-style:none;mso-wrap-distance-left:9pt;mso-wrap-distance-top:0;mso-wrap-distance-right:9pt;mso-wrap-distance-bottom:0;mso-position-horizontal:absolute;mso-position-horizontal-relative:text;mso-position-vertical:absolute;mso-position-vertical-relative:text;v-text-anchor:top" o:gfxdata="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" stroked="f">
                 <v:textbox style="mso-fit-shape-to-text:t" inset="0,0,0,0">
                   <w:txbxContent>
                     <w:p>
@@ -1601,16 +1485,16 @@
                         <w:rPr>
                           <w:i w:val="0"/>
                           <w:iCs w:val="0"/>
-                          <w:sz w:val="24"/>
-                          <w:szCs w:val="24"/>
+                          <w:sz w:val="22"/>
+                          <w:szCs w:val="22"/>
                         </w:rPr>
                       </w:pPr>
                       <w:r>
                         <w:rPr>
                           <w:i w:val="0"/>
                           <w:iCs w:val="0"/>
-                          <w:sz w:val="24"/>
-                          <w:szCs w:val="24"/>
+                          <w:sz w:val="22"/>
+                          <w:szCs w:val="22"/>
                         </w:rPr>
                         <w:t>3D</w:t>
                       </w:r>
@@ -1618,8 +1502,8 @@
                         <w:rPr>
                           <w:i w:val="0"/>
                           <w:iCs w:val="0"/>
-                          <w:sz w:val="24"/>
-                          <w:szCs w:val="24"/>
+                          <w:sz w:val="22"/>
+                          <w:szCs w:val="22"/>
                         </w:rPr>
                         <w:t>-</w:t>
                       </w:r>
@@ -1627,8 +1511,8 @@
                         <w:rPr>
                           <w:i w:val="0"/>
                           <w:iCs w:val="0"/>
-                          <w:sz w:val="24"/>
-                          <w:szCs w:val="24"/>
+                          <w:sz w:val="22"/>
+                          <w:szCs w:val="22"/>
                         </w:rPr>
                         <w:t>Bauteile:</w:t>
                       </w:r>
@@ -1641,15 +1525,15 @@
                           <w:numId w:val="2"/>
                         </w:numPr>
                         <w:rPr>
-                          <w:sz w:val="20"/>
-                          <w:szCs w:val="20"/>
+                          <w:sz w:val="22"/>
+                          <w:szCs w:val="22"/>
                           <w:lang w:val="de-DE"/>
                         </w:rPr>
                       </w:pPr>
                       <w:r>
                         <w:rPr>
-                          <w:sz w:val="20"/>
-                          <w:szCs w:val="20"/>
+                          <w:sz w:val="22"/>
+                          <w:szCs w:val="22"/>
                           <w:lang w:val="de-DE"/>
                         </w:rPr>
                         <w:t>Motor-Halterung</w:t>
@@ -1663,18 +1547,18 @@
                           <w:numId w:val="2"/>
                         </w:numPr>
                         <w:rPr>
-                          <w:sz w:val="20"/>
-                          <w:szCs w:val="20"/>
+                          <w:sz w:val="22"/>
+                          <w:szCs w:val="22"/>
                           <w:lang w:val="de-DE"/>
                         </w:rPr>
                       </w:pPr>
                       <w:r>
                         <w:rPr>
-                          <w:sz w:val="20"/>
-                          <w:szCs w:val="20"/>
+                          <w:sz w:val="22"/>
+                          <w:szCs w:val="22"/>
                           <w:lang w:val="de-DE"/>
                         </w:rPr>
-                        <w:t>Powerbank-Halterung</w:t>
+                        <w:t>Basis</w:t>
                       </w:r>
                     </w:p>
                     <w:p>
@@ -1685,15 +1569,15 @@
                           <w:numId w:val="2"/>
                         </w:numPr>
                         <w:rPr>
-                          <w:sz w:val="20"/>
-                          <w:szCs w:val="20"/>
+                          <w:sz w:val="22"/>
+                          <w:szCs w:val="22"/>
                           <w:lang w:val="de-DE"/>
                         </w:rPr>
                       </w:pPr>
                       <w:r>
                         <w:rPr>
-                          <w:sz w:val="20"/>
-                          <w:szCs w:val="20"/>
+                          <w:sz w:val="22"/>
+                          <w:szCs w:val="22"/>
                           <w:lang w:val="de-DE"/>
                         </w:rPr>
                         <w:t>Fuß</w:t>
@@ -1707,18 +1591,28 @@
                           <w:numId w:val="2"/>
                         </w:numPr>
                         <w:rPr>
-                          <w:sz w:val="20"/>
-                          <w:szCs w:val="20"/>
+                          <w:sz w:val="22"/>
+                          <w:szCs w:val="22"/>
                           <w:lang w:val="de-DE"/>
                         </w:rPr>
                       </w:pPr>
+                      <w:proofErr w:type="spellStart"/>
                       <w:r>
                         <w:rPr>
-                          <w:sz w:val="20"/>
-                          <w:szCs w:val="20"/>
+                          <w:sz w:val="22"/>
+                          <w:szCs w:val="22"/>
                           <w:lang w:val="de-DE"/>
                         </w:rPr>
-                        <w:t>ToF-Halterung</w:t>
+                        <w:t>ToF</w:t>
+                      </w:r>
+                      <w:proofErr w:type="spellEnd"/>
+                      <w:r>
+                        <w:rPr>
+                          <w:sz w:val="22"/>
+                          <w:szCs w:val="22"/>
+                          <w:lang w:val="de-DE"/>
+                        </w:rPr>
+                        <w:t>-Halterung</w:t>
                       </w:r>
                     </w:p>
                     <w:p>
@@ -1729,15 +1623,15 @@
                           <w:numId w:val="2"/>
                         </w:numPr>
                         <w:rPr>
-                          <w:sz w:val="20"/>
-                          <w:szCs w:val="20"/>
+                          <w:sz w:val="22"/>
+                          <w:szCs w:val="22"/>
                           <w:lang w:val="de-DE"/>
                         </w:rPr>
                       </w:pPr>
                       <w:r>
                         <w:rPr>
-                          <w:sz w:val="20"/>
-                          <w:szCs w:val="20"/>
+                          <w:sz w:val="22"/>
+                          <w:szCs w:val="22"/>
                           <w:lang w:val="de-DE"/>
                         </w:rPr>
                         <w:t>PCB-Halterung</w:t>
@@ -1745,6 +1639,7 @@
                     </w:p>
                   </w:txbxContent>
                 </v:textbox>
+                <w10:wrap type="tight"/>
               </v:shape>
             </w:pict>
           </mc:Fallback>
@@ -1760,103 +1655,16 @@
           <w:lang w:val="de-DE"/>
         </w:rPr>
       </w:pPr>
-      <w:r>
-        <w:rPr>
-          <w:noProof/>
-        </w:rPr>
-        <mc:AlternateContent>
-          <mc:Choice Requires="wps">
-            <w:drawing>
-              <wp:anchor distT="0" distB="0" distL="114300" distR="114300" simplePos="0" relativeHeight="251682816" behindDoc="0" locked="0" layoutInCell="1" allowOverlap="1" wp14:anchorId="18956FD3" wp14:editId="4A2D43D4">
-                <wp:simplePos x="0" y="0"/>
-                <wp:positionH relativeFrom="column">
-                  <wp:posOffset>1647190</wp:posOffset>
-                </wp:positionH>
-                <wp:positionV relativeFrom="paragraph">
-                  <wp:posOffset>221615</wp:posOffset>
-                </wp:positionV>
-                <wp:extent cx="1209040" cy="635"/>
-                <wp:effectExtent l="0" t="0" r="0" b="0"/>
-                <wp:wrapNone/>
-                <wp:docPr id="1078831630" name="Text Box 1"/>
-                <wp:cNvGraphicFramePr/>
-                <a:graphic xmlns:a="http://schemas.openxmlformats.org/drawingml/2006/main">
-                  <a:graphicData uri="http://schemas.microsoft.com/office/word/2010/wordprocessingShape">
-                    <wps:wsp>
-                      <wps:cNvSpPr txBox="1"/>
-                      <wps:spPr>
-                        <a:xfrm>
-                          <a:off x="0" y="0"/>
-                          <a:ext cx="1209040" cy="635"/>
-                        </a:xfrm>
-                        <a:prstGeom prst="rect">
-                          <a:avLst/>
-                        </a:prstGeom>
-                        <a:solidFill>
-                          <a:prstClr val="white"/>
-                        </a:solidFill>
-                        <a:ln>
-                          <a:noFill/>
-                        </a:ln>
-                      </wps:spPr>
-                      <wps:txbx>
-                        <w:txbxContent>
-                          <w:p>
-                            <w:pPr>
-                              <w:pStyle w:val="Caption"/>
-                              <w:rPr>
-                                <w:rFonts w:ascii="Arial" w:hAnsi="Arial" w:cs="Arial"/>
-                                <w:noProof/>
-                                <w:sz w:val="36"/>
-                                <w:szCs w:val="36"/>
-                                <w:lang w:val="de-DE"/>
-                              </w:rPr>
-                            </w:pPr>
-                            <w:r>
-                              <w:t>Rad</w:t>
-                            </w:r>
-                          </w:p>
-                        </w:txbxContent>
-                      </wps:txbx>
-                      <wps:bodyPr rot="0" spcFirstLastPara="0" vertOverflow="overflow" horzOverflow="overflow" vert="horz" wrap="none" lIns="0" tIns="0" rIns="0" bIns="0" numCol="1" spcCol="0" rtlCol="0" fromWordArt="0" anchor="t" anchorCtr="0" forceAA="0" compatLnSpc="1">
-                        <a:prstTxWarp prst="textNoShape">
-                          <a:avLst/>
-                        </a:prstTxWarp>
-                        <a:spAutoFit/>
-                      </wps:bodyPr>
-                    </wps:wsp>
-                  </a:graphicData>
-                </a:graphic>
-              </wp:anchor>
-            </w:drawing>
-          </mc:Choice>
-          <mc:Fallback>
-            <w:pict>
-              <v:shape w14:anchorId="18956FD3" id="_x0000_s1033" type="#_x0000_t202" style="position:absolute;margin-left:129.7pt;margin-top:17.45pt;width:95.2pt;height:.05pt;z-index:251682816;visibility:visible;mso-wrap-style:none;mso-wrap-distance-left:9pt;mso-wrap-distance-top:0;mso-wrap-distance-right:9pt;mso-wrap-distance-bottom:0;mso-position-horizontal:absolute;mso-position-horizontal-relative:text;mso-position-vertical:absolute;mso-position-vertical-relative:text;v-text-anchor:top" o:gfxdata="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" stroked="f">
-                <v:textbox style="mso-fit-shape-to-text:t" inset="0,0,0,0">
-                  <w:txbxContent>
-                    <w:p>
-                      <w:pPr>
-                        <w:pStyle w:val="Caption"/>
-                        <w:rPr>
-                          <w:rFonts w:ascii="Arial" w:hAnsi="Arial" w:cs="Arial"/>
-                          <w:noProof/>
-                          <w:sz w:val="36"/>
-                          <w:szCs w:val="36"/>
-                          <w:lang w:val="de-DE"/>
-                        </w:rPr>
-                      </w:pPr>
-                      <w:r>
-                        <w:t>Rad</w:t>
-                      </w:r>
-                    </w:p>
-                  </w:txbxContent>
-                </v:textbox>
-              </v:shape>
-            </w:pict>
-          </mc:Fallback>
-        </mc:AlternateContent>
-      </w:r>
+    </w:p>
+    <w:p>
+      <w:pPr>
+        <w:rPr>
+          <w:rFonts w:ascii="Arial" w:hAnsi="Arial" w:cs="Arial"/>
+          <w:sz w:val="36"/>
+          <w:szCs w:val="36"/>
+          <w:lang w:val="de-DE"/>
+        </w:rPr>
+      </w:pPr>
     </w:p>
     <w:p>
       <w:pPr>
@@ -2076,7 +1884,7 @@
           <w:bCs/>
           <w:lang w:val="de-DE"/>
         </w:rPr>
-        <w:t>Powerbank-Halterung</w:t>
+        <w:t>Basis</w:t>
       </w:r>
       <w:r>
         <w:rPr>
@@ -2157,7 +1965,7 @@
           <w:bCs/>
           <w:lang w:val="de-DE"/>
         </w:rPr>
-        <w:t>Powerbank-Halterung</w:t>
+        <w:t>Basis</w:t>
       </w:r>
       <w:r>
         <w:rPr>
@@ -2193,7 +2001,7 @@
           <w:bCs/>
           <w:lang w:val="de-DE"/>
         </w:rPr>
-        <w:t>Powerbank-Halterung</w:t>
+        <w:t>Basis</w:t>
       </w:r>
       <w:r>
         <w:rPr>
@@ -2238,6 +2046,7 @@
         </w:rPr>
         <w:t xml:space="preserve">Nehmen Sie die </w:t>
       </w:r>
+      <w:proofErr w:type="spellStart"/>
       <w:r>
         <w:rPr>
           <w:rFonts w:ascii="Arial" w:hAnsi="Arial" w:cs="Arial"/>
@@ -2245,29 +2054,9 @@
           <w:bCs/>
           <w:lang w:val="de-DE"/>
         </w:rPr>
-        <w:t>ToF-Halterung</w:t>
-      </w:r>
-      <w:r>
-        <w:rPr>
-          <w:rFonts w:ascii="Arial" w:hAnsi="Arial" w:cs="Arial"/>
-          <w:lang w:val="de-DE"/>
-        </w:rPr>
-        <w:t xml:space="preserve"> und stecken Sie </w:t>
-      </w:r>
-      <w:r>
-        <w:rPr>
-          <w:rFonts w:ascii="Arial" w:hAnsi="Arial" w:cs="Arial"/>
-          <w:lang w:val="de-DE"/>
-        </w:rPr>
-        <w:t>sie</w:t>
-      </w:r>
-      <w:r>
-        <w:rPr>
-          <w:rFonts w:ascii="Arial" w:hAnsi="Arial" w:cs="Arial"/>
-          <w:lang w:val="de-DE"/>
-        </w:rPr>
-        <w:t xml:space="preserve"> vorne an die </w:t>
-      </w:r>
+        <w:t>ToF</w:t>
+      </w:r>
+      <w:proofErr w:type="spellEnd"/>
       <w:r>
         <w:rPr>
           <w:rFonts w:ascii="Arial" w:hAnsi="Arial" w:cs="Arial"/>
@@ -2275,7 +2064,37 @@
           <w:bCs/>
           <w:lang w:val="de-DE"/>
         </w:rPr>
-        <w:t>Powerbank-Halterung</w:t>
+        <w:t>-Halterung</w:t>
+      </w:r>
+      <w:r>
+        <w:rPr>
+          <w:rFonts w:ascii="Arial" w:hAnsi="Arial" w:cs="Arial"/>
+          <w:lang w:val="de-DE"/>
+        </w:rPr>
+        <w:t xml:space="preserve"> und stecken Sie </w:t>
+      </w:r>
+      <w:r>
+        <w:rPr>
+          <w:rFonts w:ascii="Arial" w:hAnsi="Arial" w:cs="Arial"/>
+          <w:lang w:val="de-DE"/>
+        </w:rPr>
+        <w:t>sie</w:t>
+      </w:r>
+      <w:r>
+        <w:rPr>
+          <w:rFonts w:ascii="Arial" w:hAnsi="Arial" w:cs="Arial"/>
+          <w:lang w:val="de-DE"/>
+        </w:rPr>
+        <w:t xml:space="preserve"> vorne an die </w:t>
+      </w:r>
+      <w:r>
+        <w:rPr>
+          <w:rFonts w:ascii="Arial" w:hAnsi="Arial" w:cs="Arial"/>
+          <w:b/>
+          <w:bCs/>
+          <w:lang w:val="de-DE"/>
+        </w:rPr>
+        <w:t>Basis</w:t>
       </w:r>
       <w:r>
         <w:rPr>
@@ -2433,6 +2252,7 @@
         </w:rPr>
         <w:t xml:space="preserve">Nehmen Sie den </w:t>
       </w:r>
+      <w:proofErr w:type="spellStart"/>
       <w:r>
         <w:rPr>
           <w:rFonts w:ascii="Arial" w:hAnsi="Arial" w:cs="Arial"/>
@@ -2440,29 +2260,9 @@
           <w:bCs/>
           <w:lang w:val="de-DE"/>
         </w:rPr>
-        <w:t>ToF-Sensor</w:t>
-      </w:r>
-      <w:r>
-        <w:rPr>
-          <w:rFonts w:ascii="Arial" w:hAnsi="Arial" w:cs="Arial"/>
-          <w:lang w:val="de-DE"/>
-        </w:rPr>
-        <w:t xml:space="preserve"> und befestigen </w:t>
-      </w:r>
-      <w:r>
-        <w:rPr>
-          <w:rFonts w:ascii="Arial" w:hAnsi="Arial" w:cs="Arial"/>
-          <w:lang w:val="de-DE"/>
-        </w:rPr>
-        <w:t>ihn</w:t>
-      </w:r>
-      <w:r>
-        <w:rPr>
-          <w:rFonts w:ascii="Arial" w:hAnsi="Arial" w:cs="Arial"/>
-          <w:lang w:val="de-DE"/>
-        </w:rPr>
-        <w:t xml:space="preserve"> mit einem Kabelbinder an der </w:t>
-      </w:r>
+        <w:t>ToF</w:t>
+      </w:r>
+      <w:proofErr w:type="spellEnd"/>
       <w:r>
         <w:rPr>
           <w:rFonts w:ascii="Arial" w:hAnsi="Arial" w:cs="Arial"/>
@@ -2470,7 +2270,48 @@
           <w:bCs/>
           <w:lang w:val="de-DE"/>
         </w:rPr>
-        <w:t>ToF-Halterung</w:t>
+        <w:t>-Sensor</w:t>
+      </w:r>
+      <w:r>
+        <w:rPr>
+          <w:rFonts w:ascii="Arial" w:hAnsi="Arial" w:cs="Arial"/>
+          <w:lang w:val="de-DE"/>
+        </w:rPr>
+        <w:t xml:space="preserve"> und befestigen </w:t>
+      </w:r>
+      <w:r>
+        <w:rPr>
+          <w:rFonts w:ascii="Arial" w:hAnsi="Arial" w:cs="Arial"/>
+          <w:lang w:val="de-DE"/>
+        </w:rPr>
+        <w:t>ihn</w:t>
+      </w:r>
+      <w:r>
+        <w:rPr>
+          <w:rFonts w:ascii="Arial" w:hAnsi="Arial" w:cs="Arial"/>
+          <w:lang w:val="de-DE"/>
+        </w:rPr>
+        <w:t xml:space="preserve"> mit einem Kabelbinder an der </w:t>
+      </w:r>
+      <w:proofErr w:type="spellStart"/>
+      <w:r>
+        <w:rPr>
+          <w:rFonts w:ascii="Arial" w:hAnsi="Arial" w:cs="Arial"/>
+          <w:b/>
+          <w:bCs/>
+          <w:lang w:val="de-DE"/>
+        </w:rPr>
+        <w:t>ToF</w:t>
+      </w:r>
+      <w:proofErr w:type="spellEnd"/>
+      <w:r>
+        <w:rPr>
+          <w:rFonts w:ascii="Arial" w:hAnsi="Arial" w:cs="Arial"/>
+          <w:b/>
+          <w:bCs/>
+          <w:lang w:val="de-DE"/>
+        </w:rPr>
+        <w:t>-Halterung</w:t>
       </w:r>
       <w:r>
         <w:rPr>
@@ -2550,7 +2391,7 @@
           <w:bCs/>
           <w:lang w:val="de-DE"/>
         </w:rPr>
-        <w:t>Powerbank-Halterung</w:t>
+        <w:t>Basis</w:t>
       </w:r>
       <w:r>
         <w:rPr>
@@ -3116,6 +2957,7 @@
         </w:rPr>
         <w:t xml:space="preserve">Stecken Sie die Kabel des </w:t>
       </w:r>
+      <w:proofErr w:type="spellStart"/>
       <w:r>
         <w:rPr>
           <w:rFonts w:ascii="Arial" w:hAnsi="Arial" w:cs="Arial"/>
@@ -3125,6 +2967,7 @@
         </w:rPr>
         <w:t>ToF</w:t>
       </w:r>
+      <w:proofErr w:type="spellEnd"/>
       <w:r>
         <w:rPr>
           <w:rFonts w:ascii="Arial" w:hAnsi="Arial" w:cs="Arial"/>
@@ -3543,7 +3386,7 @@
                     <pic:cNvPicPr/>
                   </pic:nvPicPr>
                   <pic:blipFill>
-                    <a:blip r:embed="rId14">
+                    <a:blip r:embed="rId15">
                       <a:extLst>
                         <a:ext uri="{28A0092B-C50C-407E-A947-70E740481C1C}">
                           <a14:useLocalDpi xmlns:a14="http://schemas.microsoft.com/office/drawing/2010/main" val="0"/>
@@ -3671,8 +3514,17 @@
           <w:lang w:val="de-DE"/>
         </w:rPr>
         <w:tab/>
-        <w:t>-&gt; Manuell</w:t>
-      </w:r>
+        <w:t xml:space="preserve">-&gt; </w:t>
+      </w:r>
+      <w:proofErr w:type="gramStart"/>
+      <w:r>
+        <w:rPr>
+          <w:rFonts w:ascii="Arial" w:hAnsi="Arial" w:cs="Arial"/>
+          <w:lang w:val="de-DE"/>
+        </w:rPr>
+        <w:t>Manuell</w:t>
+      </w:r>
+      <w:proofErr w:type="gramEnd"/>
     </w:p>
     <w:p>
       <w:pPr>
@@ -3686,6 +3538,7 @@
           <w:lang w:val="de-DE"/>
         </w:rPr>
       </w:pPr>
+      <w:proofErr w:type="gramStart"/>
       <w:r>
         <w:rPr>
           <w:rFonts w:ascii="Arial" w:hAnsi="Arial" w:cs="Arial"/>
@@ -3699,6 +3552,13 @@
           <w:lang w:val="de-DE"/>
         </w:rPr>
         <w:tab/>
+      </w:r>
+      <w:proofErr w:type="gramEnd"/>
+      <w:r>
+        <w:rPr>
+          <w:rFonts w:ascii="Arial" w:hAnsi="Arial" w:cs="Arial"/>
+          <w:lang w:val="de-DE"/>
+        </w:rPr>
         <w:t>-&gt; Hindernisvermeidung</w:t>
       </w:r>
     </w:p>
@@ -3727,8 +3587,17 @@
           <w:lang w:val="de-DE"/>
         </w:rPr>
         <w:tab/>
-        <w:t>-&gt; Linienfolger</w:t>
-      </w:r>
+        <w:t xml:space="preserve">-&gt; </w:t>
+      </w:r>
+      <w:proofErr w:type="spellStart"/>
+      <w:r>
+        <w:rPr>
+          <w:rFonts w:ascii="Arial" w:hAnsi="Arial" w:cs="Arial"/>
+          <w:lang w:val="de-DE"/>
+        </w:rPr>
+        <w:t>Linienfolger</w:t>
+      </w:r>
+      <w:proofErr w:type="spellEnd"/>
     </w:p>
     <w:p>
       <w:pPr>
@@ -3808,22 +3677,22 @@
         <mc:AlternateContent>
           <mc:Choice Requires="wps">
             <w:drawing>
-              <wp:anchor distT="0" distB="0" distL="114300" distR="114300" simplePos="0" relativeHeight="251689984" behindDoc="1" locked="0" layoutInCell="1" allowOverlap="1" wp14:anchorId="7CAB3A91" wp14:editId="5D4D5AE6">
+              <wp:anchor distT="0" distB="0" distL="114300" distR="114300" simplePos="0" relativeHeight="251689984" behindDoc="1" locked="0" layoutInCell="1" allowOverlap="1" wp14:anchorId="7CAB3A91" wp14:editId="1BF843C5">
                 <wp:simplePos x="0" y="0"/>
                 <wp:positionH relativeFrom="column">
-                  <wp:posOffset>5577840</wp:posOffset>
+                  <wp:posOffset>5581650</wp:posOffset>
                 </wp:positionH>
                 <wp:positionV relativeFrom="paragraph">
-                  <wp:posOffset>735330</wp:posOffset>
+                  <wp:posOffset>729615</wp:posOffset>
                 </wp:positionV>
-                <wp:extent cx="1610360" cy="635"/>
+                <wp:extent cx="882650" cy="158750"/>
                 <wp:effectExtent l="0" t="0" r="0" b="0"/>
                 <wp:wrapTight wrapText="bothSides">
                   <wp:wrapPolygon edited="0">
                     <wp:start x="0" y="0"/>
-                    <wp:lineTo x="0" y="20057"/>
-                    <wp:lineTo x="21191" y="20057"/>
-                    <wp:lineTo x="21191" y="0"/>
+                    <wp:lineTo x="0" y="18144"/>
+                    <wp:lineTo x="20978" y="18144"/>
+                    <wp:lineTo x="20978" y="0"/>
                     <wp:lineTo x="0" y="0"/>
                   </wp:wrapPolygon>
                 </wp:wrapTight>
@@ -3836,7 +3705,7 @@
                       <wps:spPr>
                         <a:xfrm>
                           <a:off x="0" y="0"/>
-                          <a:ext cx="1610360" cy="635"/>
+                          <a:ext cx="882650" cy="158750"/>
                         </a:xfrm>
                         <a:prstGeom prst="rect">
                           <a:avLst/>
@@ -3863,22 +3732,28 @@
                           </w:p>
                         </w:txbxContent>
                       </wps:txbx>
-                      <wps:bodyPr rot="0" spcFirstLastPara="0" vertOverflow="overflow" horzOverflow="overflow" vert="horz" wrap="none" lIns="0" tIns="0" rIns="0" bIns="0" numCol="1" spcCol="0" rtlCol="0" fromWordArt="0" anchor="t" anchorCtr="0" forceAA="0" compatLnSpc="1">
+                      <wps:bodyPr rot="0" spcFirstLastPara="0" vertOverflow="overflow" horzOverflow="overflow" vert="horz" wrap="square" lIns="0" tIns="0" rIns="0" bIns="0" numCol="1" spcCol="0" rtlCol="0" fromWordArt="0" anchor="t" anchorCtr="0" forceAA="0" compatLnSpc="1">
                         <a:prstTxWarp prst="textNoShape">
                           <a:avLst/>
                         </a:prstTxWarp>
-                        <a:spAutoFit/>
+                        <a:noAutofit/>
                       </wps:bodyPr>
                     </wps:wsp>
                   </a:graphicData>
                 </a:graphic>
+                <wp14:sizeRelH relativeFrom="margin">
+                  <wp14:pctWidth>0</wp14:pctWidth>
+                </wp14:sizeRelH>
+                <wp14:sizeRelV relativeFrom="margin">
+                  <wp14:pctHeight>0</wp14:pctHeight>
+                </wp14:sizeRelV>
               </wp:anchor>
             </w:drawing>
           </mc:Choice>
           <mc:Fallback>
             <w:pict>
-              <v:shape w14:anchorId="7CAB3A91" id="_x0000_s1034" type="#_x0000_t202" style="position:absolute;left:0;text-align:left;margin-left:439.2pt;margin-top:57.9pt;width:126.8pt;height:.05pt;z-index:-251626496;visibility:visible;mso-wrap-style:none;mso-wrap-distance-left:9pt;mso-wrap-distance-top:0;mso-wrap-distance-right:9pt;mso-wrap-distance-bottom:0;mso-position-horizontal:absolute;mso-position-horizontal-relative:text;mso-position-vertical:absolute;mso-position-vertical-relative:text;v-text-anchor:top" o:gfxdata="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" stroked="f">
-                <v:textbox style="mso-fit-shape-to-text:t" inset="0,0,0,0">
+              <v:shape w14:anchorId="7CAB3A91" id="_x0000_s1033" type="#_x0000_t202" style="position:absolute;left:0;text-align:left;margin-left:439.5pt;margin-top:57.45pt;width:69.5pt;height:12.5pt;z-index:-251626496;visibility:visible;mso-wrap-style:square;mso-width-percent:0;mso-height-percent:0;mso-wrap-distance-left:9pt;mso-wrap-distance-top:0;mso-wrap-distance-right:9pt;mso-wrap-distance-bottom:0;mso-position-horizontal:absolute;mso-position-horizontal-relative:text;mso-position-vertical:absolute;mso-position-vertical-relative:text;mso-width-percent:0;mso-height-percent:0;mso-width-relative:margin;mso-height-relative:margin;v-text-anchor:top" o:gfxdata="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" stroked="f">
+                <v:textbox inset="0,0,0,0">
                   <w:txbxContent>
                     <w:p>
                       <w:pPr>
@@ -3978,7 +3853,23 @@
           <w:rFonts w:ascii="Arial" w:hAnsi="Arial" w:cs="Arial"/>
           <w:lang w:val="de-DE"/>
         </w:rPr>
-        <w:t>Sie anschließend folgenden QR-Code um die Steuerungsoberfläche in ihrem Browser zu öffnen; diese</w:t>
+        <w:t xml:space="preserve">Sie anschließend folgenden </w:t>
+      </w:r>
+      <w:proofErr w:type="gramStart"/>
+      <w:r>
+        <w:rPr>
+          <w:rFonts w:ascii="Arial" w:hAnsi="Arial" w:cs="Arial"/>
+          <w:lang w:val="de-DE"/>
+        </w:rPr>
+        <w:t>QR-Code</w:t>
+      </w:r>
+      <w:proofErr w:type="gramEnd"/>
+      <w:r>
+        <w:rPr>
+          <w:rFonts w:ascii="Arial" w:hAnsi="Arial" w:cs="Arial"/>
+          <w:lang w:val="de-DE"/>
+        </w:rPr>
+        <w:t xml:space="preserve"> um die Steuerungsoberfläche in ihrem Browser zu öffnen; diese</w:t>
       </w:r>
       <w:r>
         <w:rPr>
@@ -4170,13 +4061,13 @@
           <w:noProof/>
         </w:rPr>
         <w:drawing>
-          <wp:anchor distT="0" distB="0" distL="114300" distR="114300" simplePos="0" relativeHeight="251687936" behindDoc="1" locked="0" layoutInCell="1" allowOverlap="1" wp14:anchorId="5A1674FB" wp14:editId="462DECAA">
+          <wp:anchor distT="0" distB="0" distL="114300" distR="114300" simplePos="0" relativeHeight="251687936" behindDoc="1" locked="0" layoutInCell="1" allowOverlap="1" wp14:anchorId="5A1674FB" wp14:editId="0E48B2DA">
             <wp:simplePos x="0" y="0"/>
             <wp:positionH relativeFrom="column">
-              <wp:posOffset>5040630</wp:posOffset>
+              <wp:posOffset>5199380</wp:posOffset>
             </wp:positionH>
             <wp:positionV relativeFrom="paragraph">
-              <wp:posOffset>69215</wp:posOffset>
+              <wp:posOffset>5715</wp:posOffset>
             </wp:positionV>
             <wp:extent cx="1605280" cy="1605280"/>
             <wp:effectExtent l="0" t="0" r="0" b="0"/>
@@ -4201,7 +4092,7 @@
                     <pic:cNvPicPr/>
                   </pic:nvPicPr>
                   <pic:blipFill>
-                    <a:blip r:embed="rId15">
+                    <a:blip r:embed="rId16">
                       <a:extLst>
                         <a:ext uri="{28A0092B-C50C-407E-A947-70E740481C1C}">
                           <a14:useLocalDpi xmlns:a14="http://schemas.microsoft.com/office/drawing/2010/main" val="0"/>
@@ -4259,7 +4150,7 @@
           <w:szCs w:val="32"/>
           <w:lang w:val="de-DE"/>
         </w:rPr>
-        <w:t>Modifikationen</w:t>
+        <w:t>Erweiterung</w:t>
       </w:r>
     </w:p>
     <w:p>
@@ -4375,22 +4266,22 @@
         <mc:AlternateContent>
           <mc:Choice Requires="wps">
             <w:drawing>
-              <wp:anchor distT="0" distB="0" distL="114300" distR="114300" simplePos="0" relativeHeight="251692032" behindDoc="1" locked="0" layoutInCell="1" allowOverlap="1" wp14:anchorId="25456BA5" wp14:editId="22DFDC0B">
+              <wp:anchor distT="0" distB="0" distL="114300" distR="114300" simplePos="0" relativeHeight="251692032" behindDoc="1" locked="0" layoutInCell="1" allowOverlap="1" wp14:anchorId="25456BA5" wp14:editId="6E98536D">
                 <wp:simplePos x="0" y="0"/>
                 <wp:positionH relativeFrom="column">
-                  <wp:posOffset>5736590</wp:posOffset>
+                  <wp:posOffset>5905500</wp:posOffset>
                 </wp:positionH>
                 <wp:positionV relativeFrom="paragraph">
-                  <wp:posOffset>23495</wp:posOffset>
+                  <wp:posOffset>167640</wp:posOffset>
                 </wp:positionV>
-                <wp:extent cx="1605280" cy="635"/>
-                <wp:effectExtent l="0" t="0" r="635" b="0"/>
+                <wp:extent cx="1605280" cy="139700"/>
+                <wp:effectExtent l="0" t="0" r="9525" b="0"/>
                 <wp:wrapTight wrapText="bothSides">
                   <wp:wrapPolygon edited="0">
                     <wp:start x="0" y="0"/>
-                    <wp:lineTo x="0" y="20057"/>
-                    <wp:lineTo x="21165" y="20057"/>
-                    <wp:lineTo x="21165" y="0"/>
+                    <wp:lineTo x="0" y="17673"/>
+                    <wp:lineTo x="20983" y="17673"/>
+                    <wp:lineTo x="20983" y="0"/>
                     <wp:lineTo x="0" y="0"/>
                   </wp:wrapPolygon>
                 </wp:wrapTight>
@@ -4403,7 +4294,7 @@
                       <wps:spPr>
                         <a:xfrm>
                           <a:off x="0" y="0"/>
-                          <a:ext cx="1605280" cy="635"/>
+                          <a:ext cx="1605280" cy="139700"/>
                         </a:xfrm>
                         <a:prstGeom prst="rect">
                           <a:avLst/>
@@ -4424,9 +4315,11 @@
                                 <w:noProof/>
                               </w:rPr>
                             </w:pPr>
+                            <w:proofErr w:type="spellStart"/>
                             <w:r>
                               <w:t>Github</w:t>
                             </w:r>
+                            <w:proofErr w:type="spellEnd"/>
                           </w:p>
                         </w:txbxContent>
                       </wps:txbx>
@@ -4434,18 +4327,21 @@
                         <a:prstTxWarp prst="textNoShape">
                           <a:avLst/>
                         </a:prstTxWarp>
-                        <a:spAutoFit/>
+                        <a:noAutofit/>
                       </wps:bodyPr>
                     </wps:wsp>
                   </a:graphicData>
                 </a:graphic>
+                <wp14:sizeRelV relativeFrom="margin">
+                  <wp14:pctHeight>0</wp14:pctHeight>
+                </wp14:sizeRelV>
               </wp:anchor>
             </w:drawing>
           </mc:Choice>
           <mc:Fallback>
             <w:pict>
-              <v:shape w14:anchorId="25456BA5" id="_x0000_s1035" type="#_x0000_t202" style="position:absolute;left:0;text-align:left;margin-left:451.7pt;margin-top:1.85pt;width:126.4pt;height:.05pt;z-index:-251624448;visibility:visible;mso-wrap-style:none;mso-wrap-distance-left:9pt;mso-wrap-distance-top:0;mso-wrap-distance-right:9pt;mso-wrap-distance-bottom:0;mso-position-horizontal:absolute;mso-position-horizontal-relative:text;mso-position-vertical:absolute;mso-position-vertical-relative:text;v-text-anchor:top" o:gfxdata="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" stroked="f">
-                <v:textbox style="mso-fit-shape-to-text:t" inset="0,0,0,0">
+              <v:shape w14:anchorId="25456BA5" id="_x0000_s1034" type="#_x0000_t202" style="position:absolute;left:0;text-align:left;margin-left:465pt;margin-top:13.2pt;width:126.4pt;height:11pt;z-index:-251624448;visibility:visible;mso-wrap-style:none;mso-height-percent:0;mso-wrap-distance-left:9pt;mso-wrap-distance-top:0;mso-wrap-distance-right:9pt;mso-wrap-distance-bottom:0;mso-position-horizontal:absolute;mso-position-horizontal-relative:text;mso-position-vertical:absolute;mso-position-vertical-relative:text;mso-height-percent:0;mso-height-relative:margin;v-text-anchor:top" o:gfxdata="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" stroked="f">
+                <v:textbox inset="0,0,0,0">
                   <w:txbxContent>
                     <w:p>
                       <w:pPr>
@@ -4454,9 +4350,11 @@
                           <w:noProof/>
                         </w:rPr>
                       </w:pPr>
+                      <w:proofErr w:type="spellStart"/>
                       <w:r>
                         <w:t>Github</w:t>
                       </w:r>
+                      <w:proofErr w:type="spellEnd"/>
                     </w:p>
                   </w:txbxContent>
                 </v:textbox>
@@ -4580,25 +4478,9 @@
         <w:t xml:space="preserve"> </w:t>
       </w:r>
     </w:p>
-    <w:p>
-      <w:pPr>
-        <w:rPr>
-          <w:rFonts w:ascii="Arial" w:hAnsi="Arial" w:cs="Arial"/>
-          <w:lang w:val="de-DE"/>
-        </w:rPr>
-      </w:pPr>
-    </w:p>
-    <w:p>
-      <w:pPr>
-        <w:pStyle w:val="ListParagraph"/>
-        <w:ind w:left="360"/>
-        <w:rPr>
-          <w:rFonts w:ascii="Arial" w:hAnsi="Arial" w:cs="Arial"/>
-          <w:lang w:val="de-DE"/>
-        </w:rPr>
-      </w:pPr>
-    </w:p>
     <w:sectPr>
+      <w:headerReference w:type="default" r:id="rId17"/>
+      <w:footerReference w:type="default" r:id="rId18"/>
       <w:pgSz w:w="11906" w:h="16838"/>
       <w:pgMar w:top="720" w:right="720" w:bottom="720" w:left="720" w:header="708" w:footer="708" w:gutter="0"/>
       <w:cols w:space="708"/>
@@ -4606,6 +4488,199 @@
     </w:sectPr>
   </w:body>
 </w:document>
+</file>
+
+<file path=word/endnotes.xml><?xml version="1.0" encoding="utf-8"?>
+<w:endnotes xmlns:wpc="http://schemas.microsoft.com/office/word/2010/wordprocessingCanvas" xmlns:cx="http://schemas.microsoft.com/office/drawing/2014/chartex" xmlns:cx1="http://schemas.microsoft.com/office/drawing/2015/9/8/chartex" xmlns:cx2="http://schemas.microsoft.com/office/drawing/2015/10/21/chartex" xmlns:cx3="http://schemas.microsoft.com/office/drawing/2016/5/9/chartex" xmlns:cx4="http://schemas.microsoft.com/office/drawing/2016/5/10/chartex" xmlns:cx5="http://schemas.microsoft.com/office/drawing/2016/5/11/chartex" xmlns:cx6="http://schemas.microsoft.com/office/drawing/2016/5/12/chartex" xmlns:cx7="http://schemas.microsoft.com/office/drawing/2016/5/13/chartex" xmlns:cx8="http://schemas.microsoft.com/office/drawing/2016/5/14/chartex" xmlns:mc="http://schemas.openxmlformats.org/markup-compatibility/2006" xmlns:aink="http://schemas.microsoft.com/office/drawing/2016/ink" xmlns:am3d="http://schemas.microsoft.com/office/drawing/2017/model3d" xmlns:o="urn:schemas-microsoft-com:office:office" xmlns:oel="http://schemas.microsoft.com/office/2019/extlst" xmlns:r="http://schemas.openxmlformats.org/officeDocument/2006/relationships" xmlns:m="http://schemas.openxmlformats.org/officeDocument/2006/math" xmlns:v="urn:schemas-microsoft-com:vml" xmlns:wp14="http://schemas.microsoft.com/office/word/2010/wordprocessingDrawing" xmlns:wp="http://schemas.openxmlformats.org/drawingml/2006/wordprocessingDrawing" xmlns:w10="urn:schemas-microsoft-com:office:word" xmlns:w="http://schemas.openxmlformats.org/wordprocessingml/2006/main" xmlns:w14="http://schemas.microsoft.com/office/word/2010/wordml" xmlns:w15="http://schemas.microsoft.com/office/word/2012/wordml" xmlns:w16cex="http://schemas.microsoft.com/office/word/2018/wordml/cex" xmlns:w16cid="http://schemas.microsoft.com/office/word/2016/wordml/cid" xmlns:w16="http://schemas.microsoft.com/office/word/2018/wordml" xmlns:w16du="http://schemas.microsoft.com/office/word/2023/wordml/word16du" xmlns:w16sdtdh="http://schemas.microsoft.com/office/word/2020/wordml/sdtdatahash" xmlns:w16sdtfl="http://schemas.microsoft.com/office/word/2024/wordml/sdtformatlock" xmlns:w16se="http://schemas.microsoft.com/office/word/2015/wordml/symex" xmlns:wpg="http://schemas.microsoft.com/office/word/2010/wordprocessingGroup" xmlns:wpi="http://schemas.microsoft.com/office/word/2010/wordprocessingInk" xmlns:wne="http://schemas.microsoft.com/office/word/2006/wordml" xmlns:wps="http://schemas.microsoft.com/office/word/2010/wordprocessingShape" mc:Ignorable="w14 w15 w16se w16cid w16 w16cex w16sdtdh w16sdtfl w16du wp14">
+  <w:endnote w:type="separator" w:id="-1">
+    <w:p>
+      <w:pPr>
+        <w:spacing w:after="0" w:line="240" w:lineRule="auto"/>
+      </w:pPr>
+      <w:r>
+        <w:separator/>
+      </w:r>
+    </w:p>
+  </w:endnote>
+  <w:endnote w:type="continuationSeparator" w:id="0">
+    <w:p>
+      <w:pPr>
+        <w:spacing w:after="0" w:line="240" w:lineRule="auto"/>
+      </w:pPr>
+      <w:r>
+        <w:continuationSeparator/>
+      </w:r>
+    </w:p>
+  </w:endnote>
+</w:endnotes>
+</file>
+
+<file path=word/footer1.xml><?xml version="1.0" encoding="utf-8"?>
+<w:ftr xmlns:wpc="http://schemas.microsoft.com/office/word/2010/wordprocessingCanvas" xmlns:cx="http://schemas.microsoft.com/office/drawing/2014/chartex" xmlns:cx1="http://schemas.microsoft.com/office/drawing/2015/9/8/chartex" xmlns:cx2="http://schemas.microsoft.com/office/drawing/2015/10/21/chartex" xmlns:cx3="http://schemas.microsoft.com/office/drawing/2016/5/9/chartex" xmlns:cx4="http://schemas.microsoft.com/office/drawing/2016/5/10/chartex" xmlns:cx5="http://schemas.microsoft.com/office/drawing/2016/5/11/chartex" xmlns:cx6="http://schemas.microsoft.com/office/drawing/2016/5/12/chartex" xmlns:cx7="http://schemas.microsoft.com/office/drawing/2016/5/13/chartex" xmlns:cx8="http://schemas.microsoft.com/office/drawing/2016/5/14/chartex" xmlns:mc="http://schemas.openxmlformats.org/markup-compatibility/2006" xmlns:aink="http://schemas.microsoft.com/office/drawing/2016/ink" xmlns:am3d="http://schemas.microsoft.com/office/drawing/2017/model3d" xmlns:o="urn:schemas-microsoft-com:office:office" xmlns:oel="http://schemas.microsoft.com/office/2019/extlst" xmlns:r="http://schemas.openxmlformats.org/officeDocument/2006/relationships" xmlns:m="http://schemas.openxmlformats.org/officeDocument/2006/math" xmlns:v="urn:schemas-microsoft-com:vml" xmlns:wp14="http://schemas.microsoft.com/office/word/2010/wordprocessingDrawing" xmlns:wp="http://schemas.openxmlformats.org/drawingml/2006/wordprocessingDrawing" xmlns:w10="urn:schemas-microsoft-com:office:word" xmlns:w="http://schemas.openxmlformats.org/wordprocessingml/2006/main" xmlns:w14="http://schemas.microsoft.com/office/word/2010/wordml" xmlns:w15="http://schemas.microsoft.com/office/word/2012/wordml" xmlns:w16cex="http://schemas.microsoft.com/office/word/2018/wordml/cex" xmlns:w16cid="http://schemas.microsoft.com/office/word/2016/wordml/cid" xmlns:w16="http://schemas.microsoft.com/office/word/2018/wordml" xmlns:w16du="http://schemas.microsoft.com/office/word/2023/wordml/word16du" xmlns:w16sdtdh="http://schemas.microsoft.com/office/word/2020/wordml/sdtdatahash" xmlns:w16sdtfl="http://schemas.microsoft.com/office/word/2024/wordml/sdtformatlock" xmlns:w16se="http://schemas.microsoft.com/office/word/2015/wordml/symex" xmlns:wpg="http://schemas.microsoft.com/office/word/2010/wordprocessingGroup" xmlns:wpi="http://schemas.microsoft.com/office/word/2010/wordprocessingInk" xmlns:wne="http://schemas.microsoft.com/office/word/2006/wordml" xmlns:wps="http://schemas.microsoft.com/office/word/2010/wordprocessingShape" mc:Ignorable="w14 w15 w16se w16cid w16 w16cex w16sdtdh w16sdtfl w16du wp14">
+  <w:sdt>
+    <w:sdtPr>
+      <w:id w:val="-1540042871"/>
+      <w:docPartObj>
+        <w:docPartGallery w:val="Page Numbers (Bottom of Page)"/>
+        <w:docPartUnique/>
+      </w:docPartObj>
+    </w:sdtPr>
+    <w:sdtEndPr>
+      <w:rPr>
+        <w:noProof/>
+      </w:rPr>
+    </w:sdtEndPr>
+    <w:sdtContent>
+      <w:p>
+        <w:pPr>
+          <w:pStyle w:val="Footer"/>
+          <w:jc w:val="center"/>
+        </w:pPr>
+        <w:r>
+          <w:fldChar w:fldCharType="begin"/>
+        </w:r>
+        <w:r>
+          <w:instrText xml:space="preserve"> PAGE   \* MERGEFORMAT </w:instrText>
+        </w:r>
+        <w:r>
+          <w:fldChar w:fldCharType="separate"/>
+        </w:r>
+        <w:r>
+          <w:rPr>
+            <w:noProof/>
+          </w:rPr>
+          <w:t>2</w:t>
+        </w:r>
+        <w:r>
+          <w:rPr>
+            <w:noProof/>
+          </w:rPr>
+          <w:fldChar w:fldCharType="end"/>
+        </w:r>
+      </w:p>
+    </w:sdtContent>
+  </w:sdt>
+</w:ftr>
+</file>
+
+<file path=word/footnotes.xml><?xml version="1.0" encoding="utf-8"?>
+<w:footnotes xmlns:wpc="http://schemas.microsoft.com/office/word/2010/wordprocessingCanvas" xmlns:cx="http://schemas.microsoft.com/office/drawing/2014/chartex" xmlns:cx1="http://schemas.microsoft.com/office/drawing/2015/9/8/chartex" xmlns:cx2="http://schemas.microsoft.com/office/drawing/2015/10/21/chartex" xmlns:cx3="http://schemas.microsoft.com/office/drawing/2016/5/9/chartex" xmlns:cx4="http://schemas.microsoft.com/office/drawing/2016/5/10/chartex" xmlns:cx5="http://schemas.microsoft.com/office/drawing/2016/5/11/chartex" xmlns:cx6="http://schemas.microsoft.com/office/drawing/2016/5/12/chartex" xmlns:cx7="http://schemas.microsoft.com/office/drawing/2016/5/13/chartex" xmlns:cx8="http://schemas.microsoft.com/office/drawing/2016/5/14/chartex" xmlns:mc="http://schemas.openxmlformats.org/markup-compatibility/2006" xmlns:aink="http://schemas.microsoft.com/office/drawing/2016/ink" xmlns:am3d="http://schemas.microsoft.com/office/drawing/2017/model3d" xmlns:o="urn:schemas-microsoft-com:office:office" xmlns:oel="http://schemas.microsoft.com/office/2019/extlst" xmlns:r="http://schemas.openxmlformats.org/officeDocument/2006/relationships" xmlns:m="http://schemas.openxmlformats.org/officeDocument/2006/math" xmlns:v="urn:schemas-microsoft-com:vml" xmlns:wp14="http://schemas.microsoft.com/office/word/2010/wordprocessingDrawing" xmlns:wp="http://schemas.openxmlformats.org/drawingml/2006/wordprocessingDrawing" xmlns:w10="urn:schemas-microsoft-com:office:word" xmlns:w="http://schemas.openxmlformats.org/wordprocessingml/2006/main" xmlns:w14="http://schemas.microsoft.com/office/word/2010/wordml" xmlns:w15="http://schemas.microsoft.com/office/word/2012/wordml" xmlns:w16cex="http://schemas.microsoft.com/office/word/2018/wordml/cex" xmlns:w16cid="http://schemas.microsoft.com/office/word/2016/wordml/cid" xmlns:w16="http://schemas.microsoft.com/office/word/2018/wordml" xmlns:w16du="http://schemas.microsoft.com/office/word/2023/wordml/word16du" xmlns:w16sdtdh="http://schemas.microsoft.com/office/word/2020/wordml/sdtdatahash" xmlns:w16sdtfl="http://schemas.microsoft.com/office/word/2024/wordml/sdtformatlock" xmlns:w16se="http://schemas.microsoft.com/office/word/2015/wordml/symex" xmlns:wpg="http://schemas.microsoft.com/office/word/2010/wordprocessingGroup" xmlns:wpi="http://schemas.microsoft.com/office/word/2010/wordprocessingInk" xmlns:wne="http://schemas.microsoft.com/office/word/2006/wordml" xmlns:wps="http://schemas.microsoft.com/office/word/2010/wordprocessingShape" mc:Ignorable="w14 w15 w16se w16cid w16 w16cex w16sdtdh w16sdtfl w16du wp14">
+  <w:footnote w:type="separator" w:id="-1">
+    <w:p>
+      <w:pPr>
+        <w:spacing w:after="0" w:line="240" w:lineRule="auto"/>
+      </w:pPr>
+      <w:r>
+        <w:separator/>
+      </w:r>
+    </w:p>
+  </w:footnote>
+  <w:footnote w:type="continuationSeparator" w:id="0">
+    <w:p>
+      <w:pPr>
+        <w:spacing w:after="0" w:line="240" w:lineRule="auto"/>
+      </w:pPr>
+      <w:r>
+        <w:continuationSeparator/>
+      </w:r>
+    </w:p>
+  </w:footnote>
+</w:footnotes>
+</file>
+
+<file path=word/header1.xml><?xml version="1.0" encoding="utf-8"?>
+<w:hdr xmlns:wpc="http://schemas.microsoft.com/office/word/2010/wordprocessingCanvas" xmlns:cx="http://schemas.microsoft.com/office/drawing/2014/chartex" xmlns:cx1="http://schemas.microsoft.com/office/drawing/2015/9/8/chartex" xmlns:cx2="http://schemas.microsoft.com/office/drawing/2015/10/21/chartex" xmlns:cx3="http://schemas.microsoft.com/office/drawing/2016/5/9/chartex" xmlns:cx4="http://schemas.microsoft.com/office/drawing/2016/5/10/chartex" xmlns:cx5="http://schemas.microsoft.com/office/drawing/2016/5/11/chartex" xmlns:cx6="http://schemas.microsoft.com/office/drawing/2016/5/12/chartex" xmlns:cx7="http://schemas.microsoft.com/office/drawing/2016/5/13/chartex" xmlns:cx8="http://schemas.microsoft.com/office/drawing/2016/5/14/chartex" xmlns:mc="http://schemas.openxmlformats.org/markup-compatibility/2006" xmlns:aink="http://schemas.microsoft.com/office/drawing/2016/ink" xmlns:am3d="http://schemas.microsoft.com/office/drawing/2017/model3d" xmlns:o="urn:schemas-microsoft-com:office:office" xmlns:oel="http://schemas.microsoft.com/office/2019/extlst" xmlns:r="http://schemas.openxmlformats.org/officeDocument/2006/relationships" xmlns:m="http://schemas.openxmlformats.org/officeDocument/2006/math" xmlns:v="urn:schemas-microsoft-com:vml" xmlns:wp14="http://schemas.microsoft.com/office/word/2010/wordprocessingDrawing" xmlns:wp="http://schemas.openxmlformats.org/drawingml/2006/wordprocessingDrawing" xmlns:w10="urn:schemas-microsoft-com:office:word" xmlns:w="http://schemas.openxmlformats.org/wordprocessingml/2006/main" xmlns:w14="http://schemas.microsoft.com/office/word/2010/wordml" xmlns:w15="http://schemas.microsoft.com/office/word/2012/wordml" xmlns:w16cex="http://schemas.microsoft.com/office/word/2018/wordml/cex" xmlns:w16cid="http://schemas.microsoft.com/office/word/2016/wordml/cid" xmlns:w16="http://schemas.microsoft.com/office/word/2018/wordml" xmlns:w16du="http://schemas.microsoft.com/office/word/2023/wordml/word16du" xmlns:w16sdtdh="http://schemas.microsoft.com/office/word/2020/wordml/sdtdatahash" xmlns:w16sdtfl="http://schemas.microsoft.com/office/word/2024/wordml/sdtformatlock" xmlns:w16se="http://schemas.microsoft.com/office/word/2015/wordml/symex" xmlns:wpg="http://schemas.microsoft.com/office/word/2010/wordprocessingGroup" xmlns:wpi="http://schemas.microsoft.com/office/word/2010/wordprocessingInk" xmlns:wne="http://schemas.microsoft.com/office/word/2006/wordml" xmlns:wps="http://schemas.microsoft.com/office/word/2010/wordprocessingShape" mc:Ignorable="w14 w15 w16se w16cid w16 w16cex w16sdtdh w16sdtfl w16du wp14">
+  <w:p>
+    <w:pPr>
+      <w:pStyle w:val="Header"/>
+      <w:jc w:val="right"/>
+    </w:pPr>
+    <w:r>
+      <w:rPr>
+        <w:lang w:val="de-DE"/>
+      </w:rPr>
+      <w:t xml:space="preserve">Stand: </w:t>
+    </w:r>
+    <w:r>
+      <w:rPr>
+        <w:lang w:val="de-DE"/>
+      </w:rPr>
+      <w:fldChar w:fldCharType="begin"/>
+    </w:r>
+    <w:r>
+      <w:rPr>
+        <w:lang w:val="de-DE"/>
+      </w:rPr>
+      <w:instrText xml:space="preserve"> </w:instrText>
+    </w:r>
+    <w:r>
+      <w:instrText xml:space="preserve"> SAVEDATE \@ "dd.MM.yyyy</w:instrText>
+    </w:r>
+    <w:r>
+      <w:instrText>"</w:instrText>
+    </w:r>
+    <w:r>
+      <w:rPr>
+        <w:lang w:val="de-DE"/>
+      </w:rPr>
+      <w:instrText xml:space="preserve"> </w:instrText>
+    </w:r>
+    <w:r>
+      <w:rPr>
+        <w:lang w:val="de-DE"/>
+      </w:rPr>
+      <w:fldChar w:fldCharType="separate"/>
+    </w:r>
+    <w:r>
+      <w:rPr>
+        <w:noProof/>
+      </w:rPr>
+      <w:t>15.10.2026</w:t>
+    </w:r>
+    <w:r>
+      <w:rPr>
+        <w:lang w:val="de-DE"/>
+      </w:rPr>
+      <w:fldChar w:fldCharType="end"/>
+    </w:r>
+    <w:r>
+      <w:rPr>
+        <w:lang w:val="de-DE"/>
+      </w:rPr>
+      <w:fldChar w:fldCharType="begin"/>
+    </w:r>
+    <w:r>
+      <w:rPr>
+        <w:lang w:val="de-DE"/>
+      </w:rPr>
+      <w:instrText xml:space="preserve"> </w:instrText>
+    </w:r>
+    <w:r>
+      <w:rPr>
+        <w:lang w:val="de-DE"/>
+      </w:rPr>
+      <w:instrText>{ SAVEDATE \@ "dd.MM.yyyy HH:mm" }</w:instrText>
+    </w:r>
+    <w:r>
+      <w:rPr>
+        <w:lang w:val="de-DE"/>
+      </w:rPr>
+      <w:instrText xml:space="preserve"> </w:instrText>
+    </w:r>
+    <w:r>
+      <w:rPr>
+        <w:lang w:val="de-DE"/>
+      </w:rPr>
+      <w:fldChar w:fldCharType="separate"/>
+    </w:r>
+    <w:r>
+      <w:rPr>
+        <w:lang w:val="de-DE"/>
+      </w:rPr>
+      <w:fldChar w:fldCharType="end"/>
+    </w:r>
+  </w:p>
+</w:hdr>
 </file>
 
 <file path=word/numbering.xml><?xml version="1.0" encoding="utf-8"?>
@@ -4620,7 +4695,7 @@
       <w:lvlText w:val="%1."/>
       <w:lvlJc w:val="left"/>
       <w:pPr>
-        <w:ind w:left="720" w:hanging="360"/>
+        <w:ind w:left="360" w:hanging="360"/>
       </w:pPr>
       <w:rPr>
         <w:rFonts w:hint="default"/>
@@ -4632,7 +4707,7 @@
       <w:lvlText w:val="%2."/>
       <w:lvlJc w:val="left"/>
       <w:pPr>
-        <w:ind w:left="1440" w:hanging="360"/>
+        <w:ind w:left="1080" w:hanging="360"/>
       </w:pPr>
     </w:lvl>
     <w:lvl w:ilvl="2" w:tplc="0809001B" w:tentative="1">
@@ -4641,7 +4716,7 @@
       <w:lvlText w:val="%3."/>
       <w:lvlJc w:val="right"/>
       <w:pPr>
-        <w:ind w:left="2160" w:hanging="180"/>
+        <w:ind w:left="1800" w:hanging="180"/>
       </w:pPr>
     </w:lvl>
     <w:lvl w:ilvl="3" w:tplc="0809000F" w:tentative="1">
@@ -4650,7 +4725,7 @@
       <w:lvlText w:val="%4."/>
       <w:lvlJc w:val="left"/>
       <w:pPr>
-        <w:ind w:left="2880" w:hanging="360"/>
+        <w:ind w:left="2520" w:hanging="360"/>
       </w:pPr>
     </w:lvl>
     <w:lvl w:ilvl="4" w:tplc="08090019" w:tentative="1">
@@ -4659,7 +4734,7 @@
       <w:lvlText w:val="%5."/>
       <w:lvlJc w:val="left"/>
       <w:pPr>
-        <w:ind w:left="3600" w:hanging="360"/>
+        <w:ind w:left="3240" w:hanging="360"/>
       </w:pPr>
     </w:lvl>
     <w:lvl w:ilvl="5" w:tplc="0809001B" w:tentative="1">
@@ -4668,7 +4743,7 @@
       <w:lvlText w:val="%6."/>
       <w:lvlJc w:val="right"/>
       <w:pPr>
-        <w:ind w:left="4320" w:hanging="180"/>
+        <w:ind w:left="3960" w:hanging="180"/>
       </w:pPr>
     </w:lvl>
     <w:lvl w:ilvl="6" w:tplc="0809000F" w:tentative="1">
@@ -4677,7 +4752,7 @@
       <w:lvlText w:val="%7."/>
       <w:lvlJc w:val="left"/>
       <w:pPr>
-        <w:ind w:left="5040" w:hanging="360"/>
+        <w:ind w:left="4680" w:hanging="360"/>
       </w:pPr>
     </w:lvl>
     <w:lvl w:ilvl="7" w:tplc="08090019" w:tentative="1">
@@ -4686,7 +4761,7 @@
       <w:lvlText w:val="%8."/>
       <w:lvlJc w:val="left"/>
       <w:pPr>
-        <w:ind w:left="5760" w:hanging="360"/>
+        <w:ind w:left="5400" w:hanging="360"/>
       </w:pPr>
     </w:lvl>
     <w:lvl w:ilvl="8" w:tplc="0809001B" w:tentative="1">
@@ -4695,7 +4770,7 @@
       <w:lvlText w:val="%9."/>
       <w:lvlJc w:val="right"/>
       <w:pPr>
-        <w:ind w:left="6480" w:hanging="180"/>
+        <w:ind w:left="6120" w:hanging="180"/>
       </w:pPr>
     </w:lvl>
   </w:abstractNum>
@@ -5842,7 +5917,6 @@
   <w:style w:type="character" w:default="1" w:styleId="DefaultParagraphFont">
     <w:name w:val="Default Paragraph Font"/>
     <w:uiPriority w:val="1"/>
-    <w:semiHidden/>
     <w:unhideWhenUsed/>
   </w:style>
   <w:style w:type="table" w:default="1" w:styleId="TableNormal">
@@ -6175,6 +6249,80 @@
       <w:szCs w:val="18"/>
     </w:rPr>
   </w:style>
+  <w:style w:type="paragraph" w:styleId="Header">
+    <w:name w:val="header"/>
+    <w:basedOn w:val="Normal"/>
+    <w:link w:val="HeaderChar"/>
+    <w:uiPriority w:val="99"/>
+    <w:unhideWhenUsed/>
+    <w:rsid w:val="00791EAE"/>
+    <w:pPr>
+      <w:tabs>
+        <w:tab w:val="center" w:pos="4536"/>
+        <w:tab w:val="right" w:pos="9072"/>
+      </w:tabs>
+      <w:spacing w:after="0" w:line="240" w:lineRule="auto"/>
+    </w:pPr>
+  </w:style>
+  <w:style w:type="character" w:customStyle="1" w:styleId="HeaderChar">
+    <w:name w:val="Header Char"/>
+    <w:basedOn w:val="DefaultParagraphFont"/>
+    <w:link w:val="Header"/>
+    <w:uiPriority w:val="99"/>
+    <w:rsid w:val="00791EAE"/>
+  </w:style>
+  <w:style w:type="paragraph" w:styleId="Footer">
+    <w:name w:val="footer"/>
+    <w:basedOn w:val="Normal"/>
+    <w:link w:val="FooterChar"/>
+    <w:uiPriority w:val="99"/>
+    <w:unhideWhenUsed/>
+    <w:rsid w:val="00791EAE"/>
+    <w:pPr>
+      <w:tabs>
+        <w:tab w:val="center" w:pos="4536"/>
+        <w:tab w:val="right" w:pos="9072"/>
+      </w:tabs>
+      <w:spacing w:after="0" w:line="240" w:lineRule="auto"/>
+    </w:pPr>
+  </w:style>
+  <w:style w:type="character" w:customStyle="1" w:styleId="FooterChar">
+    <w:name w:val="Footer Char"/>
+    <w:basedOn w:val="DefaultParagraphFont"/>
+    <w:link w:val="Footer"/>
+    <w:uiPriority w:val="99"/>
+    <w:rsid w:val="00791EAE"/>
+  </w:style>
+  <w:style w:type="paragraph" w:styleId="HTMLPreformatted">
+    <w:name w:val="HTML Preformatted"/>
+    <w:basedOn w:val="Normal"/>
+    <w:link w:val="HTMLPreformattedChar"/>
+    <w:uiPriority w:val="99"/>
+    <w:semiHidden/>
+    <w:unhideWhenUsed/>
+    <w:rsid w:val="00791EAE"/>
+    <w:pPr>
+      <w:spacing w:after="0" w:line="240" w:lineRule="auto"/>
+    </w:pPr>
+    <w:rPr>
+      <w:rFonts w:ascii="Consolas" w:hAnsi="Consolas"/>
+      <w:sz w:val="20"/>
+      <w:szCs w:val="20"/>
+    </w:rPr>
+  </w:style>
+  <w:style w:type="character" w:customStyle="1" w:styleId="HTMLPreformattedChar">
+    <w:name w:val="HTML Preformatted Char"/>
+    <w:basedOn w:val="DefaultParagraphFont"/>
+    <w:link w:val="HTMLPreformatted"/>
+    <w:uiPriority w:val="99"/>
+    <w:semiHidden/>
+    <w:rsid w:val="00791EAE"/>
+    <w:rPr>
+      <w:rFonts w:ascii="Consolas" w:hAnsi="Consolas"/>
+      <w:sz w:val="20"/>
+      <w:szCs w:val="20"/>
+    </w:rPr>
+  </w:style>
 </w:styles>
 </file>
 

</xml_diff>